<commit_message>
Deploying to gh-pages from @ Morrison-Lab/sds@7f6698685bbb617dd8382a33f454b5c52e612c50 🚀
</commit_message>
<xml_diff>
--- a/data-handout.docx
+++ b/data-handout.docx
@@ -15,7 +15,7 @@
         <w:pStyle w:val="Date"/>
       </w:pPr>
       <w:r>
-        <w:t xml:space="preserve">Last modified: 2026-10-02 10:09:58 (PDT)</w:t>
+        <w:t xml:space="preserve">Last modified: 2026-10-02 10:23:53 (PDT)</w:t>
       </w:r>
     </w:p>
     <w:bookmarkStart w:id="27" w:name="types-of-variables"/>
@@ -1072,13 +1072,1176 @@
     </w:p>
     <w:bookmarkEnd w:id="26"/>
     <w:bookmarkEnd w:id="27"/>
-    <w:bookmarkStart w:id="35" w:name="taxonomy-of-variable-types"/>
+    <w:bookmarkStart w:id="38" w:name="sec-dummy-coding"/>
     <w:p>
       <w:pPr>
         <w:pStyle w:val="Heading2"/>
       </w:pPr>
       <w:r>
-        <w:t xml:space="preserve">2 Taxonomy of variable types</w:t>
+        <w:t xml:space="preserve">2 Coding a categorical variable with numbers</w:t>
+      </w:r>
+    </w:p>
+    <w:bookmarkStart w:id="28" w:name="exr-dummy-coding"/>
+    <w:p>
+      <w:pPr>
+        <w:pStyle w:val="FirstParagraph"/>
+      </w:pPr>
+      <w:r>
+        <w:rPr>
+          <w:b/>
+          <w:bCs/>
+        </w:rPr>
+        <w:t xml:space="preserve">Exercise 1 (Dummy coding)</w:t>
+      </w:r>
+      <w:r>
+        <w:t xml:space="preserve"> </w:t>
+      </w:r>
+      <w:r>
+        <w:t xml:space="preserve">The Western Collaborative Group Study (WCGS) variable</w:t>
+      </w:r>
+      <w:r>
+        <w:t xml:space="preserve"> </w:t>
+      </w:r>
+      <w:r>
+        <w:rPr>
+          <w:rStyle w:val="VerbatimChar"/>
+        </w:rPr>
+        <w:t xml:space="preserve">behpat</w:t>
+      </w:r>
+      <w:r>
+        <w:t xml:space="preserve"> </w:t>
+      </w:r>
+      <w:r>
+        <w:t xml:space="preserve">(behavioral pattern) has four categories:</w:t>
+      </w:r>
+      <w:r>
+        <w:t xml:space="preserve"> </w:t>
+      </w:r>
+      <w:r>
+        <w:t xml:space="preserve">A1, A2, B3, and B4.</w:t>
+      </w:r>
+    </w:p>
+    <w:p>
+      <w:pPr>
+        <w:pStyle w:val="Compact"/>
+        <w:numPr>
+          <w:ilvl w:val="0"/>
+          <w:numId w:val="1002"/>
+        </w:numPr>
+      </w:pPr>
+      <w:r>
+        <w:t xml:space="preserve">How many indicator variables are needed to represent</w:t>
+      </w:r>
+      <w:r>
+        <w:t xml:space="preserve"> </w:t>
+      </w:r>
+      <w:r>
+        <w:rPr>
+          <w:rStyle w:val="VerbatimChar"/>
+        </w:rPr>
+        <w:t xml:space="preserve">behpat</w:t>
+      </w:r>
+      <w:r>
+        <w:t xml:space="preserve"> </w:t>
+      </w:r>
+      <w:r>
+        <w:t xml:space="preserve">if A1 is the reference level?</w:t>
+      </w:r>
+    </w:p>
+    <w:p>
+      <w:pPr>
+        <w:pStyle w:val="Compact"/>
+        <w:numPr>
+          <w:ilvl w:val="0"/>
+          <w:numId w:val="1002"/>
+        </w:numPr>
+      </w:pPr>
+      <w:r>
+        <w:t xml:space="preserve">Write the values of those indicator variables,</w:t>
+      </w:r>
+      <w:r>
+        <w:t xml:space="preserve"> </w:t>
+      </w:r>
+      <w:r>
+        <w:t xml:space="preserve">in the order A2, B3, B4,</w:t>
+      </w:r>
+      <w:r>
+        <w:t xml:space="preserve"> </w:t>
+      </w:r>
+      <w:r>
+        <w:t xml:space="preserve">for a person in category B3,</w:t>
+      </w:r>
+      <w:r>
+        <w:t xml:space="preserve"> </w:t>
+      </w:r>
+      <w:r>
+        <w:t xml:space="preserve">and for a person in category A1.</w:t>
+      </w:r>
+    </w:p>
+    <w:bookmarkEnd w:id="28"/>
+    <w:bookmarkStart w:id="29" w:name="sol-dummy-coding"/>
+    <w:p>
+      <w:pPr>
+        <w:pStyle w:val="FirstParagraph"/>
+      </w:pPr>
+      <w:r>
+        <w:rPr>
+          <w:i/>
+          <w:iCs/>
+        </w:rPr>
+        <w:t xml:space="preserve">Solution 1</w:t>
+      </w:r>
+      <w:r>
+        <w:t xml:space="preserve">. </w:t>
+      </w:r>
+    </w:p>
+    <w:p>
+      <w:pPr>
+        <w:numPr>
+          <w:ilvl w:val="0"/>
+          <w:numId w:val="1003"/>
+        </w:numPr>
+      </w:pPr>
+      <w:r>
+        <w:t xml:space="preserve">3 indicator variables,</w:t>
+      </w:r>
+      <w:r>
+        <w:t xml:space="preserve"> </w:t>
+      </w:r>
+      <w:r>
+        <w:t xml:space="preserve">one for each non-reference category:</w:t>
+      </w:r>
+      <w:r>
+        <w:t xml:space="preserve"> </w:t>
+      </w:r>
+      <w:r>
+        <w:t xml:space="preserve">A2, B3, and B4.</w:t>
+      </w:r>
+    </w:p>
+    <w:p>
+      <w:pPr>
+        <w:numPr>
+          <w:ilvl w:val="0"/>
+          <w:numId w:val="1003"/>
+        </w:numPr>
+      </w:pPr>
+      <w:r>
+        <w:t xml:space="preserve">In the order (A2, B3, B4):</w:t>
+      </w:r>
+      <w:r>
+        <w:t xml:space="preserve"> </w:t>
+      </w:r>
+      <w:r>
+        <w:t xml:space="preserve">for B3, the values are (0, 1, 0);</w:t>
+      </w:r>
+      <w:r>
+        <w:t xml:space="preserve"> </w:t>
+      </w:r>
+      <w:r>
+        <w:t xml:space="preserve">for A1, the values are (0, 0, 0).</w:t>
+      </w:r>
+    </w:p>
+    <w:p>
+      <w:pPr>
+        <w:pStyle w:val="FirstParagraph"/>
+      </w:pPr>
+      <w:r>
+        <w:t xml:space="preserve">The reference level is the case where all indicators are 0.</w:t>
+      </w:r>
+    </w:p>
+    <w:bookmarkEnd w:id="29"/>
+    <w:bookmarkStart w:id="30" w:name="def-dummy-variable"/>
+    <w:p>
+      <w:pPr>
+        <w:pStyle w:val="BodyText"/>
+      </w:pPr>
+      <w:r>
+        <w:rPr>
+          <w:b/>
+          <w:bCs/>
+        </w:rPr>
+        <w:t xml:space="preserve">Definition 10 (Dummy variables)</w:t>
+      </w:r>
+      <w:r>
+        <w:t xml:space="preserve"> </w:t>
+      </w:r>
+      <w:r>
+        <w:rPr>
+          <w:b/>
+          <w:bCs/>
+        </w:rPr>
+        <w:t xml:space="preserve">Dummy variables</w:t>
+      </w:r>
+      <w:r>
+        <w:t xml:space="preserve"> </w:t>
+      </w:r>
+      <w:r>
+        <w:t xml:space="preserve">are numeric variables that, together,</w:t>
+      </w:r>
+      <w:r>
+        <w:t xml:space="preserve"> </w:t>
+      </w:r>
+      <w:r>
+        <w:t xml:space="preserve">are a numeric representation of a categorical variable.</w:t>
+      </w:r>
+    </w:p>
+    <w:bookmarkEnd w:id="30"/>
+    <w:bookmarkStart w:id="31" w:name="exm-dummy-sex"/>
+    <w:p>
+      <w:pPr>
+        <w:pStyle w:val="BodyText"/>
+      </w:pPr>
+      <w:r>
+        <w:rPr>
+          <w:b/>
+          <w:bCs/>
+        </w:rPr>
+        <w:t xml:space="preserve">Example 10 (Dummy variables for chromosomal sex)</w:t>
+      </w:r>
+      <w:r>
+        <w:t xml:space="preserve"> </w:t>
+      </w:r>
+      <w:r>
+        <w:t xml:space="preserve">Let</w:t>
+      </w:r>
+      <w:r>
+        <w:t xml:space="preserve"> </w:t>
+      </w:r>
+      <m:oMath>
+        <m:r>
+          <m:t>S</m:t>
+        </m:r>
+      </m:oMath>
+      <w:r>
+        <w:t xml:space="preserve"> </w:t>
+      </w:r>
+      <w:r>
+        <w:t xml:space="preserve">be the chromosomal sex of a newborn,</w:t>
+      </w:r>
+      <w:r>
+        <w:t xml:space="preserve"> </w:t>
+      </w:r>
+      <w:r>
+        <w:t xml:space="preserve">a categorical variable with the categories</w:t>
+      </w:r>
+      <w:r>
+        <w:t xml:space="preserve"> </w:t>
+      </w:r>
+      <w:r>
+        <w:t xml:space="preserve">“female”</w:t>
+      </w:r>
+      <w:r>
+        <w:t xml:space="preserve"> </w:t>
+      </w:r>
+      <w:r>
+        <w:t xml:space="preserve">and</w:t>
+      </w:r>
+      <w:r>
+        <w:t xml:space="preserve"> </w:t>
+      </w:r>
+      <w:r>
+        <w:t xml:space="preserve">“male”</w:t>
+      </w:r>
+      <w:r>
+        <w:t xml:space="preserve">.</w:t>
+      </w:r>
+      <w:r>
+        <w:t xml:space="preserve"> </w:t>
+      </w:r>
+      <w:r>
+        <w:t xml:space="preserve">Let</w:t>
+      </w:r>
+      <w:r>
+        <w:t xml:space="preserve"> </w:t>
+      </w:r>
+      <m:oMath>
+        <m:r>
+          <m:t>M</m:t>
+        </m:r>
+        <m:r>
+          <m:rPr>
+            <m:sty m:val="p"/>
+          </m:rPr>
+          <m:t>=</m:t>
+        </m:r>
+        <m:r>
+          <m:t>1</m:t>
+        </m:r>
+      </m:oMath>
+      <w:r>
+        <w:t xml:space="preserve"> </w:t>
+      </w:r>
+      <w:r>
+        <w:t xml:space="preserve">if</w:t>
+      </w:r>
+      <w:r>
+        <w:t xml:space="preserve"> </w:t>
+      </w:r>
+      <m:oMath>
+        <m:r>
+          <m:t>S</m:t>
+        </m:r>
+      </m:oMath>
+      <w:r>
+        <w:t xml:space="preserve"> </w:t>
+      </w:r>
+      <w:r>
+        <w:t xml:space="preserve">is</w:t>
+      </w:r>
+      <w:r>
+        <w:t xml:space="preserve"> </w:t>
+      </w:r>
+      <w:r>
+        <w:t xml:space="preserve">“male”</w:t>
+      </w:r>
+      <w:r>
+        <w:t xml:space="preserve"> </w:t>
+      </w:r>
+      <w:r>
+        <w:t xml:space="preserve">and</w:t>
+      </w:r>
+      <w:r>
+        <w:t xml:space="preserve"> </w:t>
+      </w:r>
+      <m:oMath>
+        <m:r>
+          <m:t>M</m:t>
+        </m:r>
+        <m:r>
+          <m:rPr>
+            <m:sty m:val="p"/>
+          </m:rPr>
+          <m:t>=</m:t>
+        </m:r>
+        <m:r>
+          <m:t>0</m:t>
+        </m:r>
+      </m:oMath>
+      <w:r>
+        <w:t xml:space="preserve"> </w:t>
+      </w:r>
+      <w:r>
+        <w:t xml:space="preserve">if</w:t>
+      </w:r>
+      <w:r>
+        <w:t xml:space="preserve"> </w:t>
+      </w:r>
+      <m:oMath>
+        <m:r>
+          <m:t>S</m:t>
+        </m:r>
+      </m:oMath>
+      <w:r>
+        <w:t xml:space="preserve"> </w:t>
+      </w:r>
+      <w:r>
+        <w:t xml:space="preserve">is</w:t>
+      </w:r>
+      <w:r>
+        <w:t xml:space="preserve"> </w:t>
+      </w:r>
+      <w:r>
+        <w:t xml:space="preserve">“female”</w:t>
+      </w:r>
+      <w:r>
+        <w:t xml:space="preserve">,</w:t>
+      </w:r>
+      <w:r>
+        <w:t xml:space="preserve"> </w:t>
+      </w:r>
+      <w:r>
+        <w:t xml:space="preserve">and let</w:t>
+      </w:r>
+      <w:r>
+        <w:t xml:space="preserve"> </w:t>
+      </w:r>
+      <m:oMath>
+        <m:r>
+          <m:t>F</m:t>
+        </m:r>
+        <m:r>
+          <m:rPr>
+            <m:sty m:val="p"/>
+          </m:rPr>
+          <m:t>=</m:t>
+        </m:r>
+        <m:r>
+          <m:t>1</m:t>
+        </m:r>
+      </m:oMath>
+      <w:r>
+        <w:t xml:space="preserve"> </w:t>
+      </w:r>
+      <w:r>
+        <w:t xml:space="preserve">if</w:t>
+      </w:r>
+      <w:r>
+        <w:t xml:space="preserve"> </w:t>
+      </w:r>
+      <m:oMath>
+        <m:r>
+          <m:t>S</m:t>
+        </m:r>
+      </m:oMath>
+      <w:r>
+        <w:t xml:space="preserve"> </w:t>
+      </w:r>
+      <w:r>
+        <w:t xml:space="preserve">is</w:t>
+      </w:r>
+      <w:r>
+        <w:t xml:space="preserve"> </w:t>
+      </w:r>
+      <w:r>
+        <w:t xml:space="preserve">“female”</w:t>
+      </w:r>
+      <w:r>
+        <w:t xml:space="preserve"> </w:t>
+      </w:r>
+      <w:r>
+        <w:t xml:space="preserve">and</w:t>
+      </w:r>
+      <w:r>
+        <w:t xml:space="preserve"> </w:t>
+      </w:r>
+      <m:oMath>
+        <m:r>
+          <m:t>F</m:t>
+        </m:r>
+        <m:r>
+          <m:rPr>
+            <m:sty m:val="p"/>
+          </m:rPr>
+          <m:t>=</m:t>
+        </m:r>
+        <m:r>
+          <m:t>0</m:t>
+        </m:r>
+      </m:oMath>
+      <w:r>
+        <w:t xml:space="preserve"> </w:t>
+      </w:r>
+      <w:r>
+        <w:t xml:space="preserve">if</w:t>
+      </w:r>
+      <w:r>
+        <w:t xml:space="preserve"> </w:t>
+      </w:r>
+      <m:oMath>
+        <m:r>
+          <m:t>S</m:t>
+        </m:r>
+      </m:oMath>
+      <w:r>
+        <w:t xml:space="preserve"> </w:t>
+      </w:r>
+      <w:r>
+        <w:t xml:space="preserve">is</w:t>
+      </w:r>
+      <w:r>
+        <w:t xml:space="preserve"> </w:t>
+      </w:r>
+      <w:r>
+        <w:t xml:space="preserve">“male”</w:t>
+      </w:r>
+      <w:r>
+        <w:t xml:space="preserve">.</w:t>
+      </w:r>
+      <w:r>
+        <w:t xml:space="preserve"> </w:t>
+      </w:r>
+      <w:r>
+        <w:t xml:space="preserve">Together,</w:t>
+      </w:r>
+      <w:r>
+        <w:t xml:space="preserve"> </w:t>
+      </w:r>
+      <m:oMath>
+        <m:r>
+          <m:t>M</m:t>
+        </m:r>
+      </m:oMath>
+      <w:r>
+        <w:t xml:space="preserve"> </w:t>
+      </w:r>
+      <w:r>
+        <w:t xml:space="preserve">and</w:t>
+      </w:r>
+      <w:r>
+        <w:t xml:space="preserve"> </w:t>
+      </w:r>
+      <m:oMath>
+        <m:r>
+          <m:t>F</m:t>
+        </m:r>
+      </m:oMath>
+      <w:r>
+        <w:t xml:space="preserve"> </w:t>
+      </w:r>
+      <w:r>
+        <w:t xml:space="preserve">are dummy variables for</w:t>
+      </w:r>
+      <w:r>
+        <w:t xml:space="preserve"> </w:t>
+      </w:r>
+      <m:oMath>
+        <m:r>
+          <m:t>S</m:t>
+        </m:r>
+      </m:oMath>
+      <w:r>
+        <w:t xml:space="preserve">.</w:t>
+      </w:r>
+    </w:p>
+    <w:bookmarkEnd w:id="31"/>
+    <w:bookmarkStart w:id="32" w:name="rem-dummy-other-codings"/>
+    <w:p>
+      <w:pPr>
+        <w:pStyle w:val="BodyText"/>
+      </w:pPr>
+      <w:r>
+        <w:rPr>
+          <w:i/>
+          <w:iCs/>
+        </w:rPr>
+        <w:t xml:space="preserve">Remark 1</w:t>
+      </w:r>
+      <w:r>
+        <w:t xml:space="preserve"> (Other ways to code dummy variables). </w:t>
+      </w:r>
+      <w:r>
+        <w:t xml:space="preserve">There are other ways to construct dummy variables.</w:t>
+      </w:r>
+      <w:r>
+        <w:t xml:space="preserve"> </w:t>
+      </w:r>
+      <w:r>
+        <w:t xml:space="preserve">One is to use the values</w:t>
+      </w:r>
+      <w:r>
+        <w:t xml:space="preserve"> </w:t>
+      </w:r>
+      <m:oMath>
+        <m:r>
+          <m:rPr>
+            <m:sty m:val="p"/>
+          </m:rPr>
+          <m:t>−</m:t>
+        </m:r>
+        <m:r>
+          <m:t>1</m:t>
+        </m:r>
+      </m:oMath>
+      <w:r>
+        <w:t xml:space="preserve"> </w:t>
+      </w:r>
+      <w:r>
+        <w:t xml:space="preserve">and</w:t>
+      </w:r>
+      <w:r>
+        <w:t xml:space="preserve"> </w:t>
+      </w:r>
+      <m:oMath>
+        <m:r>
+          <m:t>1</m:t>
+        </m:r>
+      </m:oMath>
+      <w:r>
+        <w:t xml:space="preserve">:</w:t>
+      </w:r>
+      <w:r>
+        <w:t xml:space="preserve"> </w:t>
+      </w:r>
+      <w:r>
+        <w:t xml:space="preserve">for example,</w:t>
+      </w:r>
+      <w:r>
+        <w:t xml:space="preserve"> </w:t>
+      </w:r>
+      <m:oMath>
+        <m:r>
+          <m:rPr>
+            <m:sty m:val="p"/>
+          </m:rPr>
+          <m:t>−</m:t>
+        </m:r>
+        <m:r>
+          <m:t>1</m:t>
+        </m:r>
+      </m:oMath>
+      <w:r>
+        <w:t xml:space="preserve"> </w:t>
+      </w:r>
+      <w:r>
+        <w:t xml:space="preserve">for</w:t>
+      </w:r>
+      <w:r>
+        <w:t xml:space="preserve"> </w:t>
+      </w:r>
+      <w:r>
+        <w:t xml:space="preserve">“female”</w:t>
+      </w:r>
+      <w:r>
+        <w:t xml:space="preserve"> </w:t>
+      </w:r>
+      <w:r>
+        <w:t xml:space="preserve">and</w:t>
+      </w:r>
+      <w:r>
+        <w:t xml:space="preserve"> </w:t>
+      </w:r>
+      <m:oMath>
+        <m:r>
+          <m:t>1</m:t>
+        </m:r>
+      </m:oMath>
+      <w:r>
+        <w:t xml:space="preserve"> </w:t>
+      </w:r>
+      <w:r>
+        <w:t xml:space="preserve">for</w:t>
+      </w:r>
+      <w:r>
+        <w:t xml:space="preserve"> </w:t>
+      </w:r>
+      <w:r>
+        <w:t xml:space="preserve">“male”</w:t>
+      </w:r>
+      <w:r>
+        <w:t xml:space="preserve">.</w:t>
+      </w:r>
+      <w:r>
+        <w:t xml:space="preserve"> </w:t>
+      </w:r>
+      <w:r>
+        <w:t xml:space="preserve">See</w:t>
+      </w:r>
+      <w:r>
+        <w:t xml:space="preserve"> </w:t>
+      </w:r>
+      <w:r>
+        <w:t xml:space="preserve">Dobson and Barnett (2018)</w:t>
+      </w:r>
+      <w:r>
+        <w:t xml:space="preserve">, section 2.4, for details.</w:t>
+      </w:r>
+    </w:p>
+    <w:bookmarkEnd w:id="32"/>
+    <w:bookmarkStart w:id="33" w:name="def-indicator-variable"/>
+    <w:p>
+      <w:pPr>
+        <w:pStyle w:val="BodyText"/>
+      </w:pPr>
+      <w:r>
+        <w:rPr>
+          <w:b/>
+          <w:bCs/>
+        </w:rPr>
+        <w:t xml:space="preserve">Definition 11 (Indicator variable)</w:t>
+      </w:r>
+      <w:r>
+        <w:t xml:space="preserve"> </w:t>
+      </w:r>
+      <w:r>
+        <w:t xml:space="preserve">An</w:t>
+      </w:r>
+      <w:r>
+        <w:t xml:space="preserve"> </w:t>
+      </w:r>
+      <w:r>
+        <w:rPr>
+          <w:b/>
+          <w:bCs/>
+        </w:rPr>
+        <w:t xml:space="preserve">indicator variable</w:t>
+      </w:r>
+      <w:r>
+        <w:t xml:space="preserve"> </w:t>
+      </w:r>
+      <w:r>
+        <w:t xml:space="preserve">is a</w:t>
+      </w:r>
+      <w:r>
+        <w:t xml:space="preserve"> </w:t>
+      </w:r>
+      <w:hyperlink w:anchor="def-dummy-variable">
+        <w:r>
+          <w:rPr>
+            <w:rStyle w:val="Hyperlink"/>
+          </w:rPr>
+          <w:t xml:space="preserve">dummy variable</w:t>
+        </w:r>
+      </w:hyperlink>
+      <w:r>
+        <w:t xml:space="preserve"> </w:t>
+      </w:r>
+      <w:r>
+        <w:t xml:space="preserve">whose only values are 0 and 1.</w:t>
+      </w:r>
+    </w:p>
+    <w:bookmarkEnd w:id="33"/>
+    <w:bookmarkStart w:id="34" w:name="exm-indicator-sex"/>
+    <w:p>
+      <w:pPr>
+        <w:pStyle w:val="BodyText"/>
+      </w:pPr>
+      <w:r>
+        <w:rPr>
+          <w:b/>
+          <w:bCs/>
+        </w:rPr>
+        <w:t xml:space="preserve">Example 11 (Indicator variables for chromosomal sex)</w:t>
+      </w:r>
+      <w:r>
+        <w:t xml:space="preserve"> </w:t>
+      </w:r>
+      <w:r>
+        <w:t xml:space="preserve">In</w:t>
+      </w:r>
+      <w:r>
+        <w:t xml:space="preserve"> </w:t>
+      </w:r>
+      <w:hyperlink w:anchor="exm-dummy-sex">
+        <w:r>
+          <w:rPr>
+            <w:rStyle w:val="Hyperlink"/>
+          </w:rPr>
+          <w:t xml:space="preserve">Example 10</w:t>
+        </w:r>
+      </w:hyperlink>
+      <w:r>
+        <w:t xml:space="preserve">,</w:t>
+      </w:r>
+      <w:r>
+        <w:t xml:space="preserve"> </w:t>
+      </w:r>
+      <m:oMath>
+        <m:r>
+          <m:t>M</m:t>
+        </m:r>
+      </m:oMath>
+      <w:r>
+        <w:t xml:space="preserve"> </w:t>
+      </w:r>
+      <w:r>
+        <w:t xml:space="preserve">and</w:t>
+      </w:r>
+      <w:r>
+        <w:t xml:space="preserve"> </w:t>
+      </w:r>
+      <m:oMath>
+        <m:r>
+          <m:t>F</m:t>
+        </m:r>
+      </m:oMath>
+      <w:r>
+        <w:t xml:space="preserve"> </w:t>
+      </w:r>
+      <w:r>
+        <w:t xml:space="preserve">are indicator variables:</w:t>
+      </w:r>
+      <w:r>
+        <w:t xml:space="preserve"> </w:t>
+      </w:r>
+      <w:r>
+        <w:t xml:space="preserve">each takes only the values 0 and 1.</w:t>
+      </w:r>
+      <w:r>
+        <w:t xml:space="preserve"> </w:t>
+      </w:r>
+      <w:r>
+        <w:t xml:space="preserve">A dummy variable that uses the values</w:t>
+      </w:r>
+      <w:r>
+        <w:t xml:space="preserve"> </w:t>
+      </w:r>
+      <m:oMath>
+        <m:r>
+          <m:rPr>
+            <m:sty m:val="p"/>
+          </m:rPr>
+          <m:t>−</m:t>
+        </m:r>
+        <m:r>
+          <m:t>1</m:t>
+        </m:r>
+      </m:oMath>
+      <w:r>
+        <w:t xml:space="preserve"> </w:t>
+      </w:r>
+      <w:r>
+        <w:t xml:space="preserve">and</w:t>
+      </w:r>
+      <w:r>
+        <w:t xml:space="preserve"> </w:t>
+      </w:r>
+      <m:oMath>
+        <m:r>
+          <m:t>1</m:t>
+        </m:r>
+      </m:oMath>
+      <w:r>
+        <w:t xml:space="preserve"> </w:t>
+      </w:r>
+      <w:r>
+        <w:t xml:space="preserve">(</w:t>
+      </w:r>
+      <w:hyperlink w:anchor="rem-dummy-other-codings">
+        <w:r>
+          <w:rPr>
+            <w:rStyle w:val="Hyperlink"/>
+          </w:rPr>
+          <w:t xml:space="preserve">Remark 1</w:t>
+        </w:r>
+      </w:hyperlink>
+      <w:r>
+        <w:t xml:space="preserve">) is not an indicator variable.</w:t>
+      </w:r>
+    </w:p>
+    <w:bookmarkEnd w:id="34"/>
+    <w:bookmarkStart w:id="35" w:name="def-reference-level"/>
+    <w:p>
+      <w:pPr>
+        <w:pStyle w:val="BodyText"/>
+      </w:pPr>
+      <w:r>
+        <w:rPr>
+          <w:b/>
+          <w:bCs/>
+        </w:rPr>
+        <w:t xml:space="preserve">Definition 12 (Reference level)</w:t>
+      </w:r>
+      <w:r>
+        <w:t xml:space="preserve"> </w:t>
+      </w:r>
+      <w:r>
+        <w:t xml:space="preserve">The</w:t>
+      </w:r>
+      <w:r>
+        <w:t xml:space="preserve"> </w:t>
+      </w:r>
+      <w:r>
+        <w:rPr>
+          <w:b/>
+          <w:bCs/>
+        </w:rPr>
+        <w:t xml:space="preserve">reference level</w:t>
+      </w:r>
+      <w:r>
+        <w:t xml:space="preserve"> </w:t>
+      </w:r>
+      <w:r>
+        <w:t xml:space="preserve">of a categorical variable</w:t>
+      </w:r>
+      <w:r>
+        <w:t xml:space="preserve"> </w:t>
+      </w:r>
+      <w:r>
+        <w:t xml:space="preserve">is the category that does not have its own</w:t>
+      </w:r>
+      <w:r>
+        <w:t xml:space="preserve"> </w:t>
+      </w:r>
+      <w:hyperlink w:anchor="def-indicator-variable">
+        <w:r>
+          <w:rPr>
+            <w:rStyle w:val="Hyperlink"/>
+          </w:rPr>
+          <w:t xml:space="preserve">indicator variable</w:t>
+        </w:r>
+      </w:hyperlink>
+      <w:r>
+        <w:t xml:space="preserve">.</w:t>
+      </w:r>
+      <w:r>
+        <w:t xml:space="preserve"> </w:t>
+      </w:r>
+      <w:r>
+        <w:t xml:space="preserve">An observation in the reference level has the value 0</w:t>
+      </w:r>
+      <w:r>
+        <w:t xml:space="preserve"> </w:t>
+      </w:r>
+      <w:r>
+        <w:t xml:space="preserve">for every indicator variable of that categorical variable.</w:t>
+      </w:r>
+    </w:p>
+    <w:bookmarkEnd w:id="35"/>
+    <w:bookmarkStart w:id="36" w:name="exm-reference-level-sex"/>
+    <w:p>
+      <w:pPr>
+        <w:pStyle w:val="BodyText"/>
+      </w:pPr>
+      <w:r>
+        <w:rPr>
+          <w:b/>
+          <w:bCs/>
+        </w:rPr>
+        <w:t xml:space="preserve">Example 12 (The reference level for chromosomal sex)</w:t>
+      </w:r>
+      <w:r>
+        <w:t xml:space="preserve"> </w:t>
+      </w:r>
+      <w:r>
+        <w:t xml:space="preserve">Take chromosomal sex</w:t>
+      </w:r>
+      <w:r>
+        <w:t xml:space="preserve"> </w:t>
+      </w:r>
+      <m:oMath>
+        <m:r>
+          <m:t>S</m:t>
+        </m:r>
+      </m:oMath>
+      <w:r>
+        <w:t xml:space="preserve"> </w:t>
+      </w:r>
+      <w:r>
+        <w:t xml:space="preserve">with the indicator variable</w:t>
+      </w:r>
+      <w:r>
+        <w:t xml:space="preserve"> </w:t>
+      </w:r>
+      <m:oMath>
+        <m:r>
+          <m:t>M</m:t>
+        </m:r>
+      </m:oMath>
+      <w:r>
+        <w:t xml:space="preserve"> </w:t>
+      </w:r>
+      <w:r>
+        <w:t xml:space="preserve">for</w:t>
+      </w:r>
+      <w:r>
+        <w:t xml:space="preserve"> </w:t>
+      </w:r>
+      <w:r>
+        <w:t xml:space="preserve">“male”</w:t>
+      </w:r>
+      <w:r>
+        <w:t xml:space="preserve"> </w:t>
+      </w:r>
+      <w:r>
+        <w:t xml:space="preserve">(</w:t>
+      </w:r>
+      <w:hyperlink w:anchor="exm-dummy-sex">
+        <w:r>
+          <w:rPr>
+            <w:rStyle w:val="Hyperlink"/>
+          </w:rPr>
+          <w:t xml:space="preserve">Example 10</w:t>
+        </w:r>
+      </w:hyperlink>
+      <w:r>
+        <w:t xml:space="preserve">).</w:t>
+      </w:r>
+      <w:r>
+        <w:t xml:space="preserve"> </w:t>
+      </w:r>
+      <w:r>
+        <w:t xml:space="preserve">The category</w:t>
+      </w:r>
+      <w:r>
+        <w:t xml:space="preserve"> </w:t>
+      </w:r>
+      <w:r>
+        <w:t xml:space="preserve">“female”</w:t>
+      </w:r>
+      <w:r>
+        <w:t xml:space="preserve"> </w:t>
+      </w:r>
+      <w:r>
+        <w:t xml:space="preserve">has no indicator variable,</w:t>
+      </w:r>
+      <w:r>
+        <w:t xml:space="preserve"> </w:t>
+      </w:r>
+      <w:r>
+        <w:t xml:space="preserve">so</w:t>
+      </w:r>
+      <w:r>
+        <w:t xml:space="preserve"> </w:t>
+      </w:r>
+      <w:r>
+        <w:t xml:space="preserve">“female”</w:t>
+      </w:r>
+      <w:r>
+        <w:t xml:space="preserve"> </w:t>
+      </w:r>
+      <w:r>
+        <w:t xml:space="preserve">is the reference level, and a female newborn has</w:t>
+      </w:r>
+      <w:r>
+        <w:t xml:space="preserve"> </w:t>
+      </w:r>
+      <m:oMath>
+        <m:r>
+          <m:t>M</m:t>
+        </m:r>
+        <m:r>
+          <m:rPr>
+            <m:sty m:val="p"/>
+          </m:rPr>
+          <m:t>=</m:t>
+        </m:r>
+        <m:r>
+          <m:t>0</m:t>
+        </m:r>
+      </m:oMath>
+      <w:r>
+        <w:t xml:space="preserve">.</w:t>
+      </w:r>
+      <w:r>
+        <w:t xml:space="preserve"> </w:t>
+      </w:r>
+      <w:r>
+        <w:t xml:space="preserve">In</w:t>
+      </w:r>
+      <w:r>
+        <w:t xml:space="preserve"> </w:t>
+      </w:r>
+      <w:hyperlink w:anchor="exr-dummy-coding">
+        <w:r>
+          <w:rPr>
+            <w:rStyle w:val="Hyperlink"/>
+          </w:rPr>
+          <w:t xml:space="preserve">Exercise 1</w:t>
+        </w:r>
+      </w:hyperlink>
+      <w:r>
+        <w:t xml:space="preserve">,</w:t>
+      </w:r>
+      <w:r>
+        <w:t xml:space="preserve"> </w:t>
+      </w:r>
+      <w:r>
+        <w:t xml:space="preserve">category A1 of</w:t>
+      </w:r>
+      <w:r>
+        <w:t xml:space="preserve"> </w:t>
+      </w:r>
+      <w:r>
+        <w:rPr>
+          <w:rStyle w:val="VerbatimChar"/>
+        </w:rPr>
+        <w:t xml:space="preserve">behpat</w:t>
+      </w:r>
+      <w:r>
+        <w:t xml:space="preserve"> </w:t>
+      </w:r>
+      <w:r>
+        <w:t xml:space="preserve">is the reference level.</w:t>
+      </w:r>
+    </w:p>
+    <w:bookmarkEnd w:id="36"/>
+    <w:bookmarkStart w:id="37" w:name="rem-reference-level-choice"/>
+    <w:p>
+      <w:pPr>
+        <w:pStyle w:val="BodyText"/>
+      </w:pPr>
+      <w:r>
+        <w:rPr>
+          <w:i/>
+          <w:iCs/>
+        </w:rPr>
+        <w:t xml:space="preserve">Remark 2</w:t>
+      </w:r>
+      <w:r>
+        <w:t xml:space="preserve"> (Any category can be the reference level). </w:t>
+      </w:r>
+      <w:r>
+        <w:t xml:space="preserve">The choice of reference level changes how we code the categories.</w:t>
+      </w:r>
+      <w:r>
+        <w:t xml:space="preserve"> </w:t>
+      </w:r>
+      <w:r>
+        <w:t xml:space="preserve">It does not change what the data say.</w:t>
+      </w:r>
+      <w:r>
+        <w:t xml:space="preserve"> </w:t>
+      </w:r>
+      <w:r>
+        <w:t xml:space="preserve">For example, in</w:t>
+      </w:r>
+      <w:r>
+        <w:t xml:space="preserve"> </w:t>
+      </w:r>
+      <w:hyperlink w:anchor="exm-reference-level-sex">
+        <w:r>
+          <w:rPr>
+            <w:rStyle w:val="Hyperlink"/>
+          </w:rPr>
+          <w:t xml:space="preserve">Example 12</w:t>
+        </w:r>
+      </w:hyperlink>
+      <w:r>
+        <w:t xml:space="preserve">,</w:t>
+      </w:r>
+      <w:r>
+        <w:t xml:space="preserve"> </w:t>
+      </w:r>
+      <w:r>
+        <w:t xml:space="preserve">we could instead use</w:t>
+      </w:r>
+      <w:r>
+        <w:t xml:space="preserve"> </w:t>
+      </w:r>
+      <w:r>
+        <w:t xml:space="preserve">“male”</w:t>
+      </w:r>
+      <w:r>
+        <w:t xml:space="preserve"> </w:t>
+      </w:r>
+      <w:r>
+        <w:t xml:space="preserve">as the reference level</w:t>
+      </w:r>
+      <w:r>
+        <w:t xml:space="preserve"> </w:t>
+      </w:r>
+      <w:r>
+        <w:t xml:space="preserve">and the indicator variable</w:t>
+      </w:r>
+      <w:r>
+        <w:t xml:space="preserve"> </w:t>
+      </w:r>
+      <m:oMath>
+        <m:r>
+          <m:t>F</m:t>
+        </m:r>
+      </m:oMath>
+      <w:r>
+        <w:t xml:space="preserve"> </w:t>
+      </w:r>
+      <w:r>
+        <w:t xml:space="preserve">for</w:t>
+      </w:r>
+      <w:r>
+        <w:t xml:space="preserve"> </w:t>
+      </w:r>
+      <w:r>
+        <w:t xml:space="preserve">“female”</w:t>
+      </w:r>
+      <w:r>
+        <w:t xml:space="preserve">.</w:t>
+      </w:r>
+      <w:r>
+        <w:t xml:space="preserve"> </w:t>
+      </w:r>
+      <w:r>
+        <w:t xml:space="preserve">Both choices describe the same two groups.</w:t>
+      </w:r>
+    </w:p>
+    <w:bookmarkEnd w:id="37"/>
+    <w:bookmarkEnd w:id="38"/>
+    <w:bookmarkStart w:id="46" w:name="taxonomy-of-variable-types"/>
+    <w:p>
+      <w:pPr>
+        <w:pStyle w:val="Heading2"/>
+      </w:pPr>
+      <w:r>
+        <w:t xml:space="preserve">3 Taxonomy of variable types</w:t>
       </w:r>
     </w:p>
     <w:p>
@@ -1113,7 +2276,7 @@
       <w:tr>
         <w:tc>
           <w:tcPr/>
-          <w:bookmarkStart w:id="31" w:name="fig-var-taxonomy"/>
+          <w:bookmarkStart w:id="42" w:name="fig-var-taxonomy"/>
           <w:p>
             <w:pPr>
               <w:pStyle w:val="SourceCode"/>
@@ -4303,18 +5466,18 @@
                 <wp:inline>
                   <wp:extent cx="4620126" cy="3696101"/>
                   <wp:effectExtent b="0" l="0" r="0" t="0"/>
-                  <wp:docPr descr="" title="" id="29" name="Picture"/>
+                  <wp:docPr descr="" title="" id="40" name="Picture"/>
                   <a:graphic>
                     <a:graphicData uri="http://schemas.openxmlformats.org/drawingml/2006/picture">
                       <pic:pic>
                         <pic:nvPicPr>
-                          <pic:cNvPr descr="data_files/figure-docx/unnamed-chunk-1-1.png" id="30" name="Picture"/>
+                          <pic:cNvPr descr="data_files/figure-docx/unnamed-chunk-1-1.png" id="41" name="Picture"/>
                           <pic:cNvPicPr>
                             <a:picLocks noChangeArrowheads="1" noChangeAspect="1"/>
                           </pic:cNvPicPr>
                         </pic:nvPicPr>
                         <pic:blipFill>
-                          <a:blip r:embed="rId28"/>
+                          <a:blip r:embed="rId39"/>
                           <a:stretch>
                             <a:fillRect/>
                           </a:stretch>
@@ -4366,7 +5529,7 @@
               <w:t xml:space="preserve">binary, nominal, and ordinal variables are discrete and categorical.</w:t>
             </w:r>
           </w:p>
-          <w:bookmarkEnd w:id="31"/>
+          <w:bookmarkEnd w:id="42"/>
         </w:tc>
       </w:tr>
     </w:tbl>
@@ -4419,18 +5582,18 @@
                 <wp:inline>
                   <wp:extent cx="152400" cy="152400"/>
                   <wp:effectExtent b="0" l="0" r="0" t="0"/>
-                  <wp:docPr descr="" title="" id="33" name="Picture"/>
+                  <wp:docPr descr="" title="" id="44" name="Picture"/>
                   <a:graphic>
                     <a:graphicData uri="http://schemas.openxmlformats.org/drawingml/2006/picture">
                       <pic:pic>
                         <pic:nvPicPr>
-                          <pic:cNvPr descr="/opt/quarto/share/formats/docx/note.png" id="34" name="Picture"/>
+                          <pic:cNvPr descr="/opt/quarto/share/formats/docx/note.png" id="45" name="Picture"/>
                           <pic:cNvPicPr>
                             <a:picLocks noChangeArrowheads="1" noChangeAspect="1"/>
                           </pic:cNvPicPr>
                         </pic:nvPicPr>
                         <pic:blipFill>
-                          <a:blip r:embed="rId32"/>
+                          <a:blip r:embed="rId43"/>
                           <a:stretch>
                             <a:fillRect/>
                           </a:stretch>
@@ -4518,14 +5681,14 @@
         </w:tc>
       </w:tr>
     </w:tbl>
-    <w:bookmarkEnd w:id="35"/>
-    <w:bookmarkStart w:id="37" w:name="variables-in-the-wcgs-dataset"/>
+    <w:bookmarkEnd w:id="46"/>
+    <w:bookmarkStart w:id="48" w:name="variables-in-the-wcgs-dataset"/>
     <w:p>
       <w:pPr>
         <w:pStyle w:val="Heading2"/>
       </w:pPr>
       <w:r>
-        <w:t xml:space="preserve">3 Variables in the WCGS dataset</w:t>
+        <w:t xml:space="preserve">4 Variables in the WCGS dataset</w:t>
       </w:r>
     </w:p>
     <w:p>
@@ -4566,7 +5729,7 @@
       <w:tr>
         <w:tc>
           <w:tcPr/>
-          <w:bookmarkStart w:id="36" w:name="tbl-wcgs-vartypes"/>
+          <w:bookmarkStart w:id="47" w:name="tbl-wcgs-vartypes"/>
           <w:p>
             <w:pPr>
               <w:jc w:val="center"/>
@@ -6266,31 +7429,31 @@
               </w:tc>
             </w:tr>
           </w:tbl>
-          <w:bookmarkEnd w:id="36"/>
+          <w:bookmarkEnd w:id="47"/>
           <w:p/>
         </w:tc>
       </w:tr>
     </w:tbl>
-    <w:bookmarkEnd w:id="37"/>
-    <w:bookmarkStart w:id="47" w:name="random-variables"/>
+    <w:bookmarkEnd w:id="48"/>
+    <w:bookmarkStart w:id="58" w:name="random-variables"/>
     <w:p>
       <w:pPr>
         <w:pStyle w:val="Heading2"/>
       </w:pPr>
       <w:r>
-        <w:t xml:space="preserve">4 Random variables</w:t>
+        <w:t xml:space="preserve">5 Random variables</w:t>
       </w:r>
     </w:p>
-    <w:bookmarkStart w:id="40" w:name="sec-binary-vars"/>
+    <w:bookmarkStart w:id="51" w:name="sec-binary-vars"/>
     <w:p>
       <w:pPr>
         <w:pStyle w:val="Heading3"/>
       </w:pPr>
       <w:r>
-        <w:t xml:space="preserve">4.1 Binary variables</w:t>
+        <w:t xml:space="preserve">5.1 Binary variables</w:t>
       </w:r>
     </w:p>
-    <w:bookmarkStart w:id="38" w:name="def-binary"/>
+    <w:bookmarkStart w:id="49" w:name="def-binary"/>
     <w:p>
       <w:pPr>
         <w:pStyle w:val="FirstParagraph"/>
@@ -6300,7 +7463,7 @@
           <w:b/>
           <w:bCs/>
         </w:rPr>
-        <w:t xml:space="preserve">Definition 10 (Binary random variable)</w:t>
+        <w:t xml:space="preserve">Definition 13 (Binary random variable)</w:t>
       </w:r>
       <w:r>
         <w:t xml:space="preserve"> </w:t>
@@ -6325,8 +7488,8 @@
         <w:t xml:space="preserve">is a random variable which has only two possible values in its range.</w:t>
       </w:r>
     </w:p>
-    <w:bookmarkEnd w:id="38"/>
-    <w:bookmarkStart w:id="39" w:name="exr-binary-examples"/>
+    <w:bookmarkEnd w:id="49"/>
+    <w:bookmarkStart w:id="50" w:name="exr-binary-examples"/>
     <w:p>
       <w:pPr>
         <w:pStyle w:val="BodyText"/>
@@ -6336,7 +7499,7 @@
           <w:b/>
           <w:bCs/>
         </w:rPr>
-        <w:t xml:space="preserve">Exercise 1 (Examples of binary variables)</w:t>
+        <w:t xml:space="preserve">Exercise 2 (Examples of binary variables)</w:t>
       </w:r>
       <w:r>
         <w:t xml:space="preserve"> </w:t>
@@ -6345,7 +7508,7 @@
         <w:t xml:space="preserve">What are some examples of binary variables in health sciences and data science?</w:t>
       </w:r>
     </w:p>
-    <w:bookmarkEnd w:id="39"/>
+    <w:bookmarkEnd w:id="50"/>
     <w:p>
       <w:pPr>
         <w:pStyle w:val="BodyText"/>
@@ -6369,7 +7532,7 @@
         <w:pStyle w:val="Compact"/>
         <w:numPr>
           <w:ilvl w:val="0"/>
-          <w:numId w:val="1002"/>
+          <w:numId w:val="1004"/>
         </w:numPr>
       </w:pPr>
       <w:r>
@@ -6381,7 +7544,7 @@
         <w:pStyle w:val="Compact"/>
         <w:numPr>
           <w:ilvl w:val="0"/>
-          <w:numId w:val="1002"/>
+          <w:numId w:val="1004"/>
         </w:numPr>
       </w:pPr>
       <w:r>
@@ -6393,7 +7556,7 @@
         <w:pStyle w:val="Compact"/>
         <w:numPr>
           <w:ilvl w:val="0"/>
-          <w:numId w:val="1002"/>
+          <w:numId w:val="1004"/>
         </w:numPr>
       </w:pPr>
       <w:r>
@@ -6405,7 +7568,7 @@
         <w:pStyle w:val="Compact"/>
         <w:numPr>
           <w:ilvl w:val="0"/>
-          <w:numId w:val="1002"/>
+          <w:numId w:val="1004"/>
         </w:numPr>
       </w:pPr>
       <w:r>
@@ -6417,7 +7580,7 @@
         <w:pStyle w:val="Compact"/>
         <w:numPr>
           <w:ilvl w:val="0"/>
-          <w:numId w:val="1002"/>
+          <w:numId w:val="1004"/>
         </w:numPr>
       </w:pPr>
       <w:r>
@@ -6429,24 +7592,24 @@
         <w:pStyle w:val="Compact"/>
         <w:numPr>
           <w:ilvl w:val="0"/>
-          <w:numId w:val="1002"/>
+          <w:numId w:val="1004"/>
         </w:numPr>
       </w:pPr>
       <w:r>
         <w:t xml:space="preserve">vital status (dead vs alive)</w:t>
       </w:r>
     </w:p>
-    <w:bookmarkEnd w:id="40"/>
-    <w:bookmarkStart w:id="46" w:name="sec-count-vars"/>
+    <w:bookmarkEnd w:id="51"/>
+    <w:bookmarkStart w:id="57" w:name="sec-count-vars"/>
     <w:p>
       <w:pPr>
         <w:pStyle w:val="Heading3"/>
       </w:pPr>
       <w:r>
-        <w:t xml:space="preserve">4.2 Count variables</w:t>
+        <w:t xml:space="preserve">5.2 Count variables</w:t>
       </w:r>
     </w:p>
-    <w:bookmarkStart w:id="41" w:name="def-count"/>
+    <w:bookmarkStart w:id="52" w:name="def-count"/>
     <w:p>
       <w:pPr>
         <w:pStyle w:val="FirstParagraph"/>
@@ -6456,7 +7619,7 @@
           <w:b/>
           <w:bCs/>
         </w:rPr>
-        <w:t xml:space="preserve">Definition 11 (Count variable)</w:t>
+        <w:t xml:space="preserve">Definition 14 (Count variable)</w:t>
       </w:r>
       <w:r>
         <w:t xml:space="preserve"> </w:t>
@@ -6554,8 +7717,8 @@
         </m:oMath>
       </m:oMathPara>
     </w:p>
-    <w:bookmarkEnd w:id="41"/>
-    <w:bookmarkStart w:id="42" w:name="exr-count-examples"/>
+    <w:bookmarkEnd w:id="52"/>
+    <w:bookmarkStart w:id="53" w:name="exr-count-examples"/>
     <w:p>
       <w:pPr>
         <w:pStyle w:val="FirstParagraph"/>
@@ -6565,7 +7728,7 @@
           <w:b/>
           <w:bCs/>
         </w:rPr>
-        <w:t xml:space="preserve">Exercise 2 (Examples of count variables)</w:t>
+        <w:t xml:space="preserve">Exercise 3 (Examples of count variables)</w:t>
       </w:r>
       <w:r>
         <w:t xml:space="preserve"> </w:t>
@@ -6574,7 +7737,7 @@
         <w:t xml:space="preserve">What are some examples of count variables?</w:t>
       </w:r>
     </w:p>
-    <w:bookmarkEnd w:id="42"/>
+    <w:bookmarkEnd w:id="53"/>
     <w:p>
       <w:pPr>
         <w:pStyle w:val="BodyText"/>
@@ -6598,7 +7761,7 @@
         <w:pStyle w:val="Compact"/>
         <w:numPr>
           <w:ilvl w:val="0"/>
-          <w:numId w:val="1003"/>
+          <w:numId w:val="1005"/>
         </w:numPr>
       </w:pPr>
       <w:r>
@@ -6610,7 +7773,7 @@
         <w:pStyle w:val="Compact"/>
         <w:numPr>
           <w:ilvl w:val="0"/>
-          <w:numId w:val="1003"/>
+          <w:numId w:val="1005"/>
         </w:numPr>
       </w:pPr>
       <w:r>
@@ -6622,7 +7785,7 @@
         <w:pStyle w:val="Compact"/>
         <w:numPr>
           <w:ilvl w:val="0"/>
-          <w:numId w:val="1003"/>
+          <w:numId w:val="1005"/>
         </w:numPr>
       </w:pPr>
       <w:r>
@@ -6634,7 +7797,7 @@
         <w:pStyle w:val="Compact"/>
         <w:numPr>
           <w:ilvl w:val="0"/>
-          <w:numId w:val="1003"/>
+          <w:numId w:val="1005"/>
         </w:numPr>
       </w:pPr>
       <w:r>
@@ -6646,7 +7809,7 @@
         <w:pStyle w:val="Compact"/>
         <w:numPr>
           <w:ilvl w:val="0"/>
-          <w:numId w:val="1003"/>
+          <w:numId w:val="1005"/>
         </w:numPr>
       </w:pPr>
       <w:r>
@@ -6658,20 +7821,20 @@
         <w:pStyle w:val="Compact"/>
         <w:numPr>
           <w:ilvl w:val="0"/>
-          <w:numId w:val="1003"/>
+          <w:numId w:val="1005"/>
         </w:numPr>
       </w:pPr>
       <w:r>
         <w:t xml:space="preserve">car accidents per 1,000 miles driven</w:t>
       </w:r>
     </w:p>
-    <w:bookmarkStart w:id="45" w:name="X6b0346f757a1c2a16c9954023d63d8ec54b03e4"/>
+    <w:bookmarkStart w:id="56" w:name="X6b0346f757a1c2a16c9954023d63d8ec54b03e4"/>
     <w:p>
       <w:pPr>
         <w:pStyle w:val="Heading4"/>
       </w:pPr>
       <w:r>
-        <w:t xml:space="preserve">4.2.1 Probability distributions for count outcomes</w:t>
+        <w:t xml:space="preserve">5.2.1 Probability distributions for count outcomes</w:t>
       </w:r>
     </w:p>
     <w:p>
@@ -6687,10 +7850,10 @@
         <w:pStyle w:val="Compact"/>
         <w:numPr>
           <w:ilvl w:val="0"/>
-          <w:numId w:val="1004"/>
+          <w:numId w:val="1006"/>
         </w:numPr>
       </w:pPr>
-      <w:hyperlink r:id="rId43">
+      <w:hyperlink r:id="rId54">
         <w:r>
           <w:rPr>
             <w:rStyle w:val="Hyperlink"/>
@@ -6704,10 +7867,10 @@
         <w:pStyle w:val="Compact"/>
         <w:numPr>
           <w:ilvl w:val="0"/>
-          <w:numId w:val="1004"/>
+          <w:numId w:val="1006"/>
         </w:numPr>
       </w:pPr>
-      <w:hyperlink r:id="rId44">
+      <w:hyperlink r:id="rId55">
         <w:r>
           <w:rPr>
             <w:rStyle w:val="Hyperlink"/>
@@ -6716,10 +7879,10 @@
         </w:r>
       </w:hyperlink>
     </w:p>
-    <w:bookmarkEnd w:id="45"/>
-    <w:bookmarkEnd w:id="46"/>
-    <w:bookmarkEnd w:id="47"/>
-    <w:bookmarkStart w:id="49" w:name="references"/>
+    <w:bookmarkEnd w:id="56"/>
+    <w:bookmarkEnd w:id="57"/>
+    <w:bookmarkEnd w:id="58"/>
+    <w:bookmarkStart w:id="62" w:name="references"/>
     <w:p>
       <w:pPr>
         <w:pStyle w:val="Heading2"/>
@@ -6728,9 +7891,46 @@
         <w:t xml:space="preserve">References</w:t>
       </w:r>
     </w:p>
-    <w:bookmarkStart w:id="48" w:name="refs"/>
-    <w:bookmarkEnd w:id="48"/>
-    <w:bookmarkEnd w:id="49"/>
+    <w:bookmarkStart w:id="61" w:name="refs"/>
+    <w:bookmarkStart w:id="60" w:name="ref-dobson4e"/>
+    <w:p>
+      <w:pPr>
+        <w:pStyle w:val="Bibliography"/>
+      </w:pPr>
+      <w:r>
+        <w:t xml:space="preserve">Dobson, Annette J, and Adrian G Barnett. 2018.</w:t>
+      </w:r>
+      <w:r>
+        <w:t xml:space="preserve"> </w:t>
+      </w:r>
+      <w:r>
+        <w:rPr>
+          <w:i/>
+          <w:iCs/>
+        </w:rPr>
+        <w:t xml:space="preserve">An Introduction to Generalized Linear Models</w:t>
+      </w:r>
+      <w:r>
+        <w:t xml:space="preserve">. 4th ed. CRC press.</w:t>
+      </w:r>
+      <w:r>
+        <w:t xml:space="preserve"> </w:t>
+      </w:r>
+      <w:hyperlink r:id="rId59">
+        <w:r>
+          <w:rPr>
+            <w:rStyle w:val="Hyperlink"/>
+          </w:rPr>
+          <w:t xml:space="preserve">https://doi.org/10.1201/9781315182780</w:t>
+        </w:r>
+      </w:hyperlink>
+      <w:r>
+        <w:t xml:space="preserve">.</w:t>
+      </w:r>
+    </w:p>
+    <w:bookmarkEnd w:id="60"/>
+    <w:bookmarkEnd w:id="61"/>
+    <w:bookmarkEnd w:id="62"/>
     <w:sectPr>
       <w:footnotePr>
         <w:numRestart w:val="eachSect"/>
@@ -6944,6 +8144,91 @@
       </w:rPr>
     </w:lvl>
   </w:abstractNum>
+  <w:abstractNum w:abstractNumId="99731">
+    <w:nsid w:val="00A99731"/>
+    <w:multiLevelType w:val="multilevel"/>
+    <w:lvl w:ilvl="0">
+      <w:start w:val="1"/>
+      <w:numFmt w:val="lowerLetter"/>
+      <w:lvlText w:val="(%1)"/>
+      <w:lvlJc w:val="left"/>
+      <w:pPr>
+        <w:ind w:left="720" w:hanging="360"/>
+      </w:pPr>
+    </w:lvl>
+    <w:lvl w:ilvl="1">
+      <w:start w:val="1"/>
+      <w:numFmt w:val="lowerLetter"/>
+      <w:lvlText w:val="(%2)"/>
+      <w:lvlJc w:val="left"/>
+      <w:pPr>
+        <w:ind w:left="1440" w:hanging="360"/>
+      </w:pPr>
+    </w:lvl>
+    <w:lvl w:ilvl="2">
+      <w:start w:val="1"/>
+      <w:numFmt w:val="lowerLetter"/>
+      <w:lvlText w:val="(%3)"/>
+      <w:lvlJc w:val="left"/>
+      <w:pPr>
+        <w:ind w:left="2160" w:hanging="360"/>
+      </w:pPr>
+    </w:lvl>
+    <w:lvl w:ilvl="3">
+      <w:start w:val="1"/>
+      <w:numFmt w:val="lowerLetter"/>
+      <w:lvlText w:val="(%4)"/>
+      <w:lvlJc w:val="left"/>
+      <w:pPr>
+        <w:ind w:left="2880" w:hanging="360"/>
+      </w:pPr>
+    </w:lvl>
+    <w:lvl w:ilvl="4">
+      <w:start w:val="1"/>
+      <w:numFmt w:val="lowerLetter"/>
+      <w:lvlText w:val="(%5)"/>
+      <w:lvlJc w:val="left"/>
+      <w:pPr>
+        <w:ind w:left="3600" w:hanging="360"/>
+      </w:pPr>
+    </w:lvl>
+    <w:lvl w:ilvl="5">
+      <w:start w:val="1"/>
+      <w:numFmt w:val="lowerLetter"/>
+      <w:lvlText w:val="(%6)"/>
+      <w:lvlJc w:val="left"/>
+      <w:pPr>
+        <w:ind w:left="4320" w:hanging="360"/>
+      </w:pPr>
+    </w:lvl>
+    <w:lvl w:ilvl="6">
+      <w:start w:val="1"/>
+      <w:numFmt w:val="lowerLetter"/>
+      <w:lvlText w:val="(%7)"/>
+      <w:lvlJc w:val="left"/>
+      <w:pPr>
+        <w:ind w:left="5040" w:hanging="360"/>
+      </w:pPr>
+    </w:lvl>
+    <w:lvl w:ilvl="7">
+      <w:start w:val="1"/>
+      <w:numFmt w:val="lowerLetter"/>
+      <w:lvlText w:val="(%8)"/>
+      <w:lvlJc w:val="left"/>
+      <w:pPr>
+        <w:ind w:left="5760" w:hanging="360"/>
+      </w:pPr>
+    </w:lvl>
+    <w:lvl w:ilvl="8">
+      <w:start w:val="1"/>
+      <w:numFmt w:val="lowerLetter"/>
+      <w:lvlText w:val="(%9)"/>
+      <w:lvlJc w:val="left"/>
+      <w:pPr>
+        <w:ind w:left="6480" w:hanging="360"/>
+      </w:pPr>
+    </w:lvl>
+  </w:abstractNum>
   <w:num w:numId="1000">
     <w:abstractNumId w:val="990"/>
   </w:num>
@@ -6951,12 +8236,72 @@
     <w:abstractNumId w:val="991"/>
   </w:num>
   <w:num w:numId="1002">
+    <w:abstractNumId w:val="99731"/>
+    <w:lvlOverride w:ilvl="0">
+      <w:startOverride w:val="1"/>
+    </w:lvlOverride>
+    <w:lvlOverride w:ilvl="1">
+      <w:startOverride w:val="1"/>
+    </w:lvlOverride>
+    <w:lvlOverride w:ilvl="2">
+      <w:startOverride w:val="1"/>
+    </w:lvlOverride>
+    <w:lvlOverride w:ilvl="3">
+      <w:startOverride w:val="1"/>
+    </w:lvlOverride>
+    <w:lvlOverride w:ilvl="4">
+      <w:startOverride w:val="1"/>
+    </w:lvlOverride>
+    <w:lvlOverride w:ilvl="5">
+      <w:startOverride w:val="1"/>
+    </w:lvlOverride>
+    <w:lvlOverride w:ilvl="6">
+      <w:startOverride w:val="1"/>
+    </w:lvlOverride>
+    <w:lvlOverride w:ilvl="7">
+      <w:startOverride w:val="1"/>
+    </w:lvlOverride>
+    <w:lvlOverride w:ilvl="8">
+      <w:startOverride w:val="1"/>
+    </w:lvlOverride>
+  </w:num>
+  <w:num w:numId="1003">
+    <w:abstractNumId w:val="99731"/>
+    <w:lvlOverride w:ilvl="0">
+      <w:startOverride w:val="1"/>
+    </w:lvlOverride>
+    <w:lvlOverride w:ilvl="1">
+      <w:startOverride w:val="1"/>
+    </w:lvlOverride>
+    <w:lvlOverride w:ilvl="2">
+      <w:startOverride w:val="1"/>
+    </w:lvlOverride>
+    <w:lvlOverride w:ilvl="3">
+      <w:startOverride w:val="1"/>
+    </w:lvlOverride>
+    <w:lvlOverride w:ilvl="4">
+      <w:startOverride w:val="1"/>
+    </w:lvlOverride>
+    <w:lvlOverride w:ilvl="5">
+      <w:startOverride w:val="1"/>
+    </w:lvlOverride>
+    <w:lvlOverride w:ilvl="6">
+      <w:startOverride w:val="1"/>
+    </w:lvlOverride>
+    <w:lvlOverride w:ilvl="7">
+      <w:startOverride w:val="1"/>
+    </w:lvlOverride>
+    <w:lvlOverride w:ilvl="8">
+      <w:startOverride w:val="1"/>
+    </w:lvlOverride>
+  </w:num>
+  <w:num w:numId="1004">
     <w:abstractNumId w:val="991"/>
   </w:num>
-  <w:num w:numId="1003">
+  <w:num w:numId="1005">
     <w:abstractNumId w:val="991"/>
   </w:num>
-  <w:num w:numId="1004">
+  <w:num w:numId="1006">
     <w:abstractNumId w:val="991"/>
   </w:num>
 </w:numbering>

</xml_diff>

<commit_message>
Deploying to gh-pages from @ Morrison-Lab/sds@f2d9a002b4ef20b35639a3f904d54e1c0452369e 🚀
</commit_message>
<xml_diff>
--- a/data-handout.docx
+++ b/data-handout.docx
@@ -15,7 +15,7 @@
         <w:pStyle w:val="Date"/>
       </w:pPr>
       <w:r>
-        <w:t xml:space="preserve">Last modified: 2026-10-15 05:47:35 (PDT)</w:t>
+        <w:t xml:space="preserve">Last modified: 2026-10-15 06:02:37 (PDT)</w:t>
       </w:r>
     </w:p>
     <w:bookmarkStart w:id="29" w:name="types-of-variables"/>
@@ -114,7 +114,7 @@
           <w:b/>
           <w:bCs/>
         </w:rPr>
-        <w:t xml:space="preserve">Definition 1 (Numerical variable)</w:t>
+        <w:t xml:space="preserve">Definition 1 (Numerical variable (quantitative variable))</w:t>
       </w:r>
       <w:r>
         <w:t xml:space="preserve"> </w:t>
@@ -698,7 +698,7 @@
           <w:b/>
           <w:bCs/>
         </w:rPr>
-        <w:t xml:space="preserve">Definition 6 (Categorical variable)</w:t>
+        <w:t xml:space="preserve">Definition 6 (Categorical variable (qualitative variable))</w:t>
       </w:r>
       <w:r>
         <w:t xml:space="preserve"> </w:t>

</xml_diff>

<commit_message>
Deploying to gh-pages from @ Morrison-Lab/sds@f5e815fd7eeae5d396ed03bb0fbc062f001ca4f7 🚀
</commit_message>
<xml_diff>
--- a/data-handout.docx
+++ b/data-handout.docx
@@ -15,7 +15,7 @@
         <w:pStyle w:val="Date"/>
       </w:pPr>
       <w:r>
-        <w:t xml:space="preserve">Last modified: 2026-10-15 18:39:30 (PDT)</w:t>
+        <w:t xml:space="preserve">Last modified: 2026-10-15 18:55:10 (PDT)</w:t>
       </w:r>
     </w:p>
     <w:bookmarkStart w:id="29" w:name="types-of-variables"/>
@@ -1042,7 +1042,7 @@
     </w:p>
     <w:bookmarkEnd w:id="28"/>
     <w:bookmarkEnd w:id="29"/>
-    <w:bookmarkStart w:id="43" w:name="sec-dummy-coding"/>
+    <w:bookmarkStart w:id="41" w:name="sec-dummy-coding"/>
     <w:p>
       <w:pPr>
         <w:pStyle w:val="Heading2"/>
@@ -1255,31 +1255,25 @@
         <w:t xml:space="preserve">are a numeric representation of a categorical variable.</w:t>
       </w:r>
     </w:p>
+    <w:p>
+      <w:pPr>
+        <w:pStyle w:val="BodyText"/>
+      </w:pPr>
+      <w:r>
+        <w:t xml:space="preserve">Source:</w:t>
+      </w:r>
+      <w:r>
+        <w:t xml:space="preserve"> </w:t>
+      </w:r>
+      <w:r>
+        <w:t xml:space="preserve">Dobson and Barnett (2018, sec. 2.4)</w:t>
+      </w:r>
+      <w:r>
+        <w:t xml:space="preserve">.</w:t>
+      </w:r>
+    </w:p>
     <w:bookmarkEnd w:id="32"/>
-    <w:bookmarkStart w:id="33" w:name="rem-source-dummy-variable"/>
-    <w:p>
-      <w:pPr>
-        <w:pStyle w:val="BodyText"/>
-      </w:pPr>
-      <w:r>
-        <w:rPr>
-          <w:i/>
-          <w:iCs/>
-        </w:rPr>
-        <w:t xml:space="preserve">Remark 3</w:t>
-      </w:r>
-      <w:r>
-        <w:t xml:space="preserve"> (Source: Dummy variables). </w:t>
-      </w:r>
-      <w:r>
-        <w:t xml:space="preserve">Dobson and Barnett (2018, sec. 2.4)</w:t>
-      </w:r>
-      <w:r>
-        <w:t xml:space="preserve">.</w:t>
-      </w:r>
-    </w:p>
-    <w:bookmarkEnd w:id="33"/>
-    <w:bookmarkStart w:id="34" w:name="exm-dummy-sex"/>
+    <w:bookmarkStart w:id="33" w:name="exm-dummy-sex"/>
     <w:p>
       <w:pPr>
         <w:pStyle w:val="BodyText"/>
@@ -1586,8 +1580,8 @@
         <w:t xml:space="preserve">.</w:t>
       </w:r>
     </w:p>
-    <w:bookmarkEnd w:id="34"/>
-    <w:bookmarkStart w:id="35" w:name="rem-dummy-other-codings"/>
+    <w:bookmarkEnd w:id="33"/>
+    <w:bookmarkStart w:id="34" w:name="rem-dummy-other-codings"/>
     <w:p>
       <w:pPr>
         <w:pStyle w:val="BodyText"/>
@@ -1597,7 +1591,7 @@
           <w:i/>
           <w:iCs/>
         </w:rPr>
-        <w:t xml:space="preserve">Remark 4</w:t>
+        <w:t xml:space="preserve">Remark 3</w:t>
       </w:r>
       <w:r>
         <w:t xml:space="preserve"> (Other ways to code dummy variables). </w:t>
@@ -1719,8 +1713,8 @@
         <w:t xml:space="preserve">, section 2.4, for details.</w:t>
       </w:r>
     </w:p>
-    <w:bookmarkEnd w:id="35"/>
-    <w:bookmarkStart w:id="36" w:name="def-indicator-variable"/>
+    <w:bookmarkEnd w:id="34"/>
+    <w:bookmarkStart w:id="35" w:name="def-indicator-variable"/>
     <w:p>
       <w:pPr>
         <w:pStyle w:val="BodyText"/>
@@ -1772,21 +1766,15 @@
         <w:t xml:space="preserve">whose only values are 0 and 1.</w:t>
       </w:r>
     </w:p>
-    <w:bookmarkEnd w:id="36"/>
-    <w:bookmarkStart w:id="37" w:name="rem-source-indicator-variable"/>
     <w:p>
       <w:pPr>
         <w:pStyle w:val="BodyText"/>
       </w:pPr>
       <w:r>
-        <w:rPr>
-          <w:i/>
-          <w:iCs/>
-        </w:rPr>
-        <w:t xml:space="preserve">Remark 5</w:t>
-      </w:r>
-      <w:r>
-        <w:t xml:space="preserve"> (Source: Indicator variable). </w:t>
+        <w:t xml:space="preserve">Source:</w:t>
+      </w:r>
+      <w:r>
+        <w:t xml:space="preserve"> </w:t>
       </w:r>
       <w:r>
         <w:t xml:space="preserve">Dobson and Barnett (2018, sec. 2.4)</w:t>
@@ -1795,8 +1783,8 @@
         <w:t xml:space="preserve">.</w:t>
       </w:r>
     </w:p>
-    <w:bookmarkEnd w:id="37"/>
-    <w:bookmarkStart w:id="38" w:name="exm-indicator-sex"/>
+    <w:bookmarkEnd w:id="35"/>
+    <w:bookmarkStart w:id="36" w:name="exm-indicator-sex"/>
     <w:p>
       <w:pPr>
         <w:pStyle w:val="BodyText"/>
@@ -1907,15 +1895,15 @@
           <w:rPr>
             <w:rStyle w:val="Hyperlink"/>
           </w:rPr>
-          <w:t xml:space="preserve">Remark 4</w:t>
+          <w:t xml:space="preserve">Remark 3</w:t>
         </w:r>
       </w:hyperlink>
       <w:r>
         <w:t xml:space="preserve">) is not an indicator variable.</w:t>
       </w:r>
     </w:p>
-    <w:bookmarkEnd w:id="38"/>
-    <w:bookmarkStart w:id="39" w:name="def-reference-level"/>
+    <w:bookmarkEnd w:id="36"/>
+    <w:bookmarkStart w:id="37" w:name="def-reference-level"/>
     <w:p>
       <w:pPr>
         <w:pStyle w:val="BodyText"/>
@@ -1982,8 +1970,8 @@
         <w:t xml:space="preserve">for every indicator variable of that categorical variable.</w:t>
       </w:r>
     </w:p>
-    <w:bookmarkEnd w:id="39"/>
-    <w:bookmarkStart w:id="40" w:name="rem-source-reference-level"/>
+    <w:bookmarkEnd w:id="37"/>
+    <w:bookmarkStart w:id="38" w:name="rem-source-reference-level"/>
     <w:p>
       <w:pPr>
         <w:pStyle w:val="BodyText"/>
@@ -1993,7 +1981,7 @@
           <w:i/>
           <w:iCs/>
         </w:rPr>
-        <w:t xml:space="preserve">Remark 6</w:t>
+        <w:t xml:space="preserve">Remark 4</w:t>
       </w:r>
       <w:r>
         <w:t xml:space="preserve"> (Source: Reference level). </w:t>
@@ -2005,8 +1993,8 @@
         <w:t xml:space="preserve">, who call this the corner point parameterization.</w:t>
       </w:r>
     </w:p>
-    <w:bookmarkEnd w:id="40"/>
-    <w:bookmarkStart w:id="41" w:name="exm-reference-level-sex"/>
+    <w:bookmarkEnd w:id="38"/>
+    <w:bookmarkStart w:id="39" w:name="exm-reference-level-sex"/>
     <w:p>
       <w:pPr>
         <w:pStyle w:val="BodyText"/>
@@ -2173,8 +2161,8 @@
         <w:t xml:space="preserve">is the reference level.</w:t>
       </w:r>
     </w:p>
-    <w:bookmarkEnd w:id="41"/>
-    <w:bookmarkStart w:id="42" w:name="rem-reference-level-choice"/>
+    <w:bookmarkEnd w:id="39"/>
+    <w:bookmarkStart w:id="40" w:name="rem-reference-level-choice"/>
     <w:p>
       <w:pPr>
         <w:pStyle w:val="BodyText"/>
@@ -2184,7 +2172,7 @@
           <w:i/>
           <w:iCs/>
         </w:rPr>
-        <w:t xml:space="preserve">Remark 7</w:t>
+        <w:t xml:space="preserve">Remark 5</w:t>
       </w:r>
       <w:r>
         <w:t xml:space="preserve"> (Any category can be the reference level). </w:t>
@@ -2272,9 +2260,9 @@
         <w:t xml:space="preserve">Both choices describe the same two groups.</w:t>
       </w:r>
     </w:p>
-    <w:bookmarkEnd w:id="42"/>
-    <w:bookmarkEnd w:id="43"/>
-    <w:bookmarkStart w:id="51" w:name="taxonomy-of-variable-types"/>
+    <w:bookmarkEnd w:id="40"/>
+    <w:bookmarkEnd w:id="41"/>
+    <w:bookmarkStart w:id="49" w:name="taxonomy-of-variable-types"/>
     <w:p>
       <w:pPr>
         <w:pStyle w:val="Heading2"/>
@@ -2315,7 +2303,7 @@
       <w:tr>
         <w:tc>
           <w:tcPr/>
-          <w:bookmarkStart w:id="47" w:name="fig-var-taxonomy"/>
+          <w:bookmarkStart w:id="45" w:name="fig-var-taxonomy"/>
           <w:p>
             <w:pPr>
               <w:pStyle w:val="SourceCode"/>
@@ -5505,18 +5493,18 @@
                 <wp:inline>
                   <wp:extent cx="4620126" cy="3696101"/>
                   <wp:effectExtent b="0" l="0" r="0" t="0"/>
-                  <wp:docPr descr="" title="" id="45" name="Picture"/>
+                  <wp:docPr descr="" title="" id="43" name="Picture"/>
                   <a:graphic>
                     <a:graphicData uri="http://schemas.openxmlformats.org/drawingml/2006/picture">
                       <pic:pic>
                         <pic:nvPicPr>
-                          <pic:cNvPr descr="data_files/figure-docx/unnamed-chunk-1-1.png" id="46" name="Picture"/>
+                          <pic:cNvPr descr="data_files/figure-docx/unnamed-chunk-1-1.png" id="44" name="Picture"/>
                           <pic:cNvPicPr>
                             <a:picLocks noChangeArrowheads="1" noChangeAspect="1"/>
                           </pic:cNvPicPr>
                         </pic:nvPicPr>
                         <pic:blipFill>
-                          <a:blip r:embed="rId44"/>
+                          <a:blip r:embed="rId42"/>
                           <a:stretch>
                             <a:fillRect/>
                           </a:stretch>
@@ -5568,7 +5556,7 @@
               <w:t xml:space="preserve">binary, nominal, and ordinal variables are discrete and categorical.</w:t>
             </w:r>
           </w:p>
-          <w:bookmarkEnd w:id="47"/>
+          <w:bookmarkEnd w:id="45"/>
         </w:tc>
       </w:tr>
     </w:tbl>
@@ -5621,18 +5609,18 @@
                 <wp:inline>
                   <wp:extent cx="152400" cy="152400"/>
                   <wp:effectExtent b="0" l="0" r="0" t="0"/>
-                  <wp:docPr descr="" title="" id="49" name="Picture"/>
+                  <wp:docPr descr="" title="" id="47" name="Picture"/>
                   <a:graphic>
                     <a:graphicData uri="http://schemas.openxmlformats.org/drawingml/2006/picture">
                       <pic:pic>
                         <pic:nvPicPr>
-                          <pic:cNvPr descr="/opt/quarto/share/formats/docx/note.png" id="50" name="Picture"/>
+                          <pic:cNvPr descr="/opt/quarto/share/formats/docx/note.png" id="48" name="Picture"/>
                           <pic:cNvPicPr>
                             <a:picLocks noChangeArrowheads="1" noChangeAspect="1"/>
                           </pic:cNvPicPr>
                         </pic:nvPicPr>
                         <pic:blipFill>
-                          <a:blip r:embed="rId48"/>
+                          <a:blip r:embed="rId46"/>
                           <a:stretch>
                             <a:fillRect/>
                           </a:stretch>
@@ -5720,8 +5708,8 @@
         </w:tc>
       </w:tr>
     </w:tbl>
-    <w:bookmarkEnd w:id="51"/>
-    <w:bookmarkStart w:id="53" w:name="variables-in-the-wcgs-dataset"/>
+    <w:bookmarkEnd w:id="49"/>
+    <w:bookmarkStart w:id="51" w:name="variables-in-the-wcgs-dataset"/>
     <w:p>
       <w:pPr>
         <w:pStyle w:val="Heading2"/>
@@ -5768,7 +5756,7 @@
       <w:tr>
         <w:tc>
           <w:tcPr/>
-          <w:bookmarkStart w:id="52" w:name="tbl-wcgs-vartypes"/>
+          <w:bookmarkStart w:id="50" w:name="tbl-wcgs-vartypes"/>
           <w:p>
             <w:pPr>
               <w:jc w:val="center"/>
@@ -7468,13 +7456,13 @@
               </w:tc>
             </w:tr>
           </w:tbl>
-          <w:bookmarkEnd w:id="52"/>
+          <w:bookmarkEnd w:id="50"/>
           <w:p/>
         </w:tc>
       </w:tr>
     </w:tbl>
-    <w:bookmarkEnd w:id="53"/>
-    <w:bookmarkStart w:id="65" w:name="random-variables"/>
+    <w:bookmarkEnd w:id="51"/>
+    <w:bookmarkStart w:id="63" w:name="random-variables"/>
     <w:p>
       <w:pPr>
         <w:pStyle w:val="Heading2"/>
@@ -7483,7 +7471,7 @@
         <w:t xml:space="preserve">5 Random variables</w:t>
       </w:r>
     </w:p>
-    <w:bookmarkStart w:id="57" w:name="sec-binary-vars"/>
+    <w:bookmarkStart w:id="55" w:name="sec-binary-vars"/>
     <w:p>
       <w:pPr>
         <w:pStyle w:val="Heading3"/>
@@ -7492,7 +7480,7 @@
         <w:t xml:space="preserve">5.1 Binary variables</w:t>
       </w:r>
     </w:p>
-    <w:bookmarkStart w:id="54" w:name="def-binary"/>
+    <w:bookmarkStart w:id="52" w:name="def-binary"/>
     <w:p>
       <w:pPr>
         <w:pStyle w:val="FirstParagraph"/>
@@ -7527,8 +7515,8 @@
         <w:t xml:space="preserve">is a random variable which has only two possible values in its range.</w:t>
       </w:r>
     </w:p>
-    <w:bookmarkEnd w:id="54"/>
-    <w:bookmarkStart w:id="55" w:name="exr-binary-examples"/>
+    <w:bookmarkEnd w:id="52"/>
+    <w:bookmarkStart w:id="53" w:name="exr-binary-examples"/>
     <w:p>
       <w:pPr>
         <w:pStyle w:val="BodyText"/>
@@ -7547,8 +7535,8 @@
         <w:t xml:space="preserve">What are some examples of binary variables in health sciences and data science?</w:t>
       </w:r>
     </w:p>
-    <w:bookmarkEnd w:id="55"/>
-    <w:bookmarkStart w:id="56" w:name="sol-binary-examples"/>
+    <w:bookmarkEnd w:id="53"/>
+    <w:bookmarkStart w:id="54" w:name="sol-binary-examples"/>
     <w:p>
       <w:pPr>
         <w:pStyle w:val="BodyText"/>
@@ -7639,9 +7627,9 @@
         <w:t xml:space="preserve">vital status (dead vs alive)</w:t>
       </w:r>
     </w:p>
-    <w:bookmarkEnd w:id="56"/>
-    <w:bookmarkEnd w:id="57"/>
-    <w:bookmarkStart w:id="64" w:name="sec-count-vars"/>
+    <w:bookmarkEnd w:id="54"/>
+    <w:bookmarkEnd w:id="55"/>
+    <w:bookmarkStart w:id="62" w:name="sec-count-vars"/>
     <w:p>
       <w:pPr>
         <w:pStyle w:val="Heading3"/>
@@ -7650,7 +7638,7 @@
         <w:t xml:space="preserve">5.2 Count variables</w:t>
       </w:r>
     </w:p>
-    <w:bookmarkStart w:id="58" w:name="def-count"/>
+    <w:bookmarkStart w:id="56" w:name="def-count"/>
     <w:p>
       <w:pPr>
         <w:pStyle w:val="FirstParagraph"/>
@@ -7758,8 +7746,8 @@
         </m:oMath>
       </m:oMathPara>
     </w:p>
-    <w:bookmarkEnd w:id="58"/>
-    <w:bookmarkStart w:id="59" w:name="exr-count-examples"/>
+    <w:bookmarkEnd w:id="56"/>
+    <w:bookmarkStart w:id="57" w:name="exr-count-examples"/>
     <w:p>
       <w:pPr>
         <w:pStyle w:val="FirstParagraph"/>
@@ -7778,8 +7766,8 @@
         <w:t xml:space="preserve">What are some examples of count variables?</w:t>
       </w:r>
     </w:p>
-    <w:bookmarkEnd w:id="59"/>
-    <w:bookmarkStart w:id="60" w:name="sol-count-examples"/>
+    <w:bookmarkEnd w:id="57"/>
+    <w:bookmarkStart w:id="58" w:name="sol-count-examples"/>
     <w:p>
       <w:pPr>
         <w:pStyle w:val="BodyText"/>
@@ -7870,8 +7858,8 @@
         <w:t xml:space="preserve">car accidents per 1,000 miles driven</w:t>
       </w:r>
     </w:p>
-    <w:bookmarkEnd w:id="60"/>
-    <w:bookmarkStart w:id="63" w:name="X6b0346f757a1c2a16c9954023d63d8ec54b03e4"/>
+    <w:bookmarkEnd w:id="58"/>
+    <w:bookmarkStart w:id="61" w:name="X6b0346f757a1c2a16c9954023d63d8ec54b03e4"/>
     <w:p>
       <w:pPr>
         <w:pStyle w:val="Heading4"/>
@@ -7896,7 +7884,7 @@
           <w:numId w:val="1006"/>
         </w:numPr>
       </w:pPr>
-      <w:hyperlink r:id="rId61">
+      <w:hyperlink r:id="rId59">
         <w:r>
           <w:rPr>
             <w:rStyle w:val="Hyperlink"/>
@@ -7913,7 +7901,7 @@
           <w:numId w:val="1006"/>
         </w:numPr>
       </w:pPr>
-      <w:hyperlink r:id="rId62">
+      <w:hyperlink r:id="rId60">
         <w:r>
           <w:rPr>
             <w:rStyle w:val="Hyperlink"/>
@@ -7922,10 +7910,10 @@
         </w:r>
       </w:hyperlink>
     </w:p>
+    <w:bookmarkEnd w:id="61"/>
+    <w:bookmarkEnd w:id="62"/>
     <w:bookmarkEnd w:id="63"/>
-    <w:bookmarkEnd w:id="64"/>
-    <w:bookmarkEnd w:id="65"/>
-    <w:bookmarkStart w:id="69" w:name="references"/>
+    <w:bookmarkStart w:id="67" w:name="references"/>
     <w:p>
       <w:pPr>
         <w:pStyle w:val="Heading2"/>
@@ -7934,8 +7922,8 @@
         <w:t xml:space="preserve">References</w:t>
       </w:r>
     </w:p>
-    <w:bookmarkStart w:id="68" w:name="refs"/>
-    <w:bookmarkStart w:id="67" w:name="ref-dobson4e"/>
+    <w:bookmarkStart w:id="66" w:name="refs"/>
+    <w:bookmarkStart w:id="65" w:name="ref-dobson4e"/>
     <w:p>
       <w:pPr>
         <w:pStyle w:val="Bibliography"/>
@@ -7959,7 +7947,7 @@
       <w:r>
         <w:t xml:space="preserve"> </w:t>
       </w:r>
-      <w:hyperlink r:id="rId66">
+      <w:hyperlink r:id="rId64">
         <w:r>
           <w:rPr>
             <w:rStyle w:val="Hyperlink"/>
@@ -7971,9 +7959,9 @@
         <w:t xml:space="preserve">.</w:t>
       </w:r>
     </w:p>
+    <w:bookmarkEnd w:id="65"/>
+    <w:bookmarkEnd w:id="66"/>
     <w:bookmarkEnd w:id="67"/>
-    <w:bookmarkEnd w:id="68"/>
-    <w:bookmarkEnd w:id="69"/>
     <w:sectPr>
       <w:footnotePr>
         <w:numRestart w:val="eachSect"/>

</xml_diff>

<commit_message>
Deploying to gh-pages from @ Morrison-Lab/sds@33c02e148d40512b5aaca2ceacbb284bb6bef05e 🚀
</commit_message>
<xml_diff>
--- a/data-handout.docx
+++ b/data-handout.docx
@@ -15,10 +15,10 @@
         <w:pStyle w:val="Date"/>
       </w:pPr>
       <w:r>
-        <w:t xml:space="preserve">Last modified: 2026-10-19 13:38:50 (PDT)</w:t>
+        <w:t xml:space="preserve">Last modified: 2026-10-19 14:20:11 (PDT)</w:t>
       </w:r>
     </w:p>
-    <w:bookmarkStart w:id="29" w:name="types-of-variables"/>
+    <w:bookmarkStart w:id="30" w:name="types-of-variables"/>
     <w:p>
       <w:pPr>
         <w:pStyle w:val="Heading2"/>
@@ -169,11 +169,430 @@
       <w:r>
         <w:t xml:space="preserve">are meaningful.</w:t>
       </w:r>
-      <w:r>
-        <w:t xml:space="preserve"> </w:t>
-      </w:r>
-      <w:r>
-        <w:t xml:space="preserve">Numerical variables may be further classified as</w:t>
+    </w:p>
+    <w:bookmarkEnd w:id="9"/>
+    <w:bookmarkStart w:id="10" w:name="exm-numerical-var"/>
+    <w:p>
+      <w:pPr>
+        <w:pStyle w:val="BodyText"/>
+      </w:pPr>
+      <w:r>
+        <w:rPr>
+          <w:b/>
+          <w:bCs/>
+        </w:rPr>
+        <w:t xml:space="preserve">Example 1 (Numerical variables in the WCGS)</w:t>
+      </w:r>
+      <w:r>
+        <w:t xml:space="preserve"> </w:t>
+      </w:r>
+      <w:r>
+        <w:t xml:space="preserve">Age, systolic blood pressure, total cholesterol, and number of cigarettes</w:t>
+      </w:r>
+      <w:r>
+        <w:t xml:space="preserve"> </w:t>
+      </w:r>
+      <w:r>
+        <w:t xml:space="preserve">smoked per day are numerical variables in the WCGS dataset.</w:t>
+      </w:r>
+    </w:p>
+    <w:bookmarkEnd w:id="10"/>
+    <w:bookmarkStart w:id="11" w:name="def-interval-var"/>
+    <w:p>
+      <w:pPr>
+        <w:pStyle w:val="BodyText"/>
+      </w:pPr>
+      <w:r>
+        <w:rPr>
+          <w:b/>
+          <w:bCs/>
+        </w:rPr>
+        <w:t xml:space="preserve">Definition 2 (Interval variable)</w:t>
+      </w:r>
+      <w:r>
+        <w:t xml:space="preserve"> </w:t>
+      </w:r>
+      <w:r>
+        <w:t xml:space="preserve">An</w:t>
+      </w:r>
+      <w:r>
+        <w:t xml:space="preserve"> </w:t>
+      </w:r>
+      <w:r>
+        <w:rPr>
+          <w:b/>
+          <w:bCs/>
+        </w:rPr>
+        <w:t xml:space="preserve">interval variable</w:t>
+      </w:r>
+      <w:r>
+        <w:t xml:space="preserve"> </w:t>
+      </w:r>
+      <w:r>
+        <w:t xml:space="preserve">is a numerical variable for which</w:t>
+      </w:r>
+      <w:r>
+        <w:t xml:space="preserve"> </w:t>
+      </w:r>
+      <w:r>
+        <w:t xml:space="preserve">differences between values are meaningful,</w:t>
+      </w:r>
+      <w:r>
+        <w:t xml:space="preserve"> </w:t>
+      </w:r>
+      <w:r>
+        <w:t xml:space="preserve">but there is no natural zero point</w:t>
+      </w:r>
+      <w:r>
+        <w:t xml:space="preserve"> </w:t>
+      </w:r>
+      <w:r>
+        <w:t xml:space="preserve">(so ratios of values are not meaningful).</w:t>
+      </w:r>
+    </w:p>
+    <w:bookmarkEnd w:id="11"/>
+    <w:bookmarkStart w:id="12" w:name="exm-interval-var"/>
+    <w:p>
+      <w:pPr>
+        <w:pStyle w:val="BodyText"/>
+      </w:pPr>
+      <w:r>
+        <w:rPr>
+          <w:b/>
+          <w:bCs/>
+        </w:rPr>
+        <w:t xml:space="preserve">Example 2 (Temperature in degrees Celsius)</w:t>
+      </w:r>
+      <w:r>
+        <w:t xml:space="preserve"> </w:t>
+      </w:r>
+      <w:r>
+        <w:t xml:space="preserve">Temperature in degrees Celsius is an interval variable:</w:t>
+      </w:r>
+      <w:r>
+        <w:t xml:space="preserve"> </w:t>
+      </w:r>
+      <w:r>
+        <w:t xml:space="preserve">a difference of 10 deg C is meaningful,</w:t>
+      </w:r>
+      <w:r>
+        <w:t xml:space="preserve"> </w:t>
+      </w:r>
+      <w:r>
+        <w:t xml:space="preserve">but 30 deg C is not</w:t>
+      </w:r>
+      <w:r>
+        <w:t xml:space="preserve"> </w:t>
+      </w:r>
+      <w:r>
+        <w:t xml:space="preserve">“twice as hot”</w:t>
+      </w:r>
+      <w:r>
+        <w:t xml:space="preserve"> </w:t>
+      </w:r>
+      <w:r>
+        <w:t xml:space="preserve">as 15 deg C</w:t>
+      </w:r>
+      <w:r>
+        <w:t xml:space="preserve"> </w:t>
+      </w:r>
+      <w:r>
+        <w:t xml:space="preserve">because 0 deg C is an arbitrary zero point (the freezing point of water)</w:t>
+      </w:r>
+      <w:r>
+        <w:t xml:space="preserve"> </w:t>
+      </w:r>
+      <w:r>
+        <w:t xml:space="preserve">rather than the complete absence of heat.</w:t>
+      </w:r>
+    </w:p>
+    <w:bookmarkEnd w:id="12"/>
+    <w:bookmarkStart w:id="13" w:name="def-ratio-var"/>
+    <w:p>
+      <w:pPr>
+        <w:pStyle w:val="BodyText"/>
+      </w:pPr>
+      <w:r>
+        <w:rPr>
+          <w:b/>
+          <w:bCs/>
+        </w:rPr>
+        <w:t xml:space="preserve">Definition 3 (Ratio variable)</w:t>
+      </w:r>
+      <w:r>
+        <w:t xml:space="preserve"> </w:t>
+      </w:r>
+      <w:r>
+        <w:t xml:space="preserve">A</w:t>
+      </w:r>
+      <w:r>
+        <w:t xml:space="preserve"> </w:t>
+      </w:r>
+      <w:r>
+        <w:rPr>
+          <w:b/>
+          <w:bCs/>
+        </w:rPr>
+        <w:t xml:space="preserve">ratio variable</w:t>
+      </w:r>
+      <w:r>
+        <w:t xml:space="preserve"> </w:t>
+      </w:r>
+      <w:r>
+        <w:t xml:space="preserve">is a numerical variable with a natural zero point,</w:t>
+      </w:r>
+      <w:r>
+        <w:t xml:space="preserve"> </w:t>
+      </w:r>
+      <w:r>
+        <w:t xml:space="preserve">so that both differences and ratios of values are meaningful.</w:t>
+      </w:r>
+    </w:p>
+    <w:bookmarkEnd w:id="13"/>
+    <w:bookmarkStart w:id="14" w:name="exm-ratio-var"/>
+    <w:p>
+      <w:pPr>
+        <w:pStyle w:val="BodyText"/>
+      </w:pPr>
+      <w:r>
+        <w:rPr>
+          <w:b/>
+          <w:bCs/>
+        </w:rPr>
+        <w:t xml:space="preserve">Example 3 (Ratio variables in the WCGS)</w:t>
+      </w:r>
+      <w:r>
+        <w:t xml:space="preserve"> </w:t>
+      </w:r>
+      <w:r>
+        <w:t xml:space="preserve">Age, weight, cholesterol, blood pressure, and number of cigarettes per day</w:t>
+      </w:r>
+      <w:r>
+        <w:t xml:space="preserve"> </w:t>
+      </w:r>
+      <w:r>
+        <w:t xml:space="preserve">are ratio variables:</w:t>
+      </w:r>
+      <w:r>
+        <w:t xml:space="preserve"> </w:t>
+      </w:r>
+      <w:r>
+        <w:t xml:space="preserve">a value of 0 represents the complete absence of the quantity,</w:t>
+      </w:r>
+      <w:r>
+        <w:t xml:space="preserve"> </w:t>
+      </w:r>
+      <w:r>
+        <w:t xml:space="preserve">so ratios of values are meaningful.</w:t>
+      </w:r>
+    </w:p>
+    <w:bookmarkEnd w:id="14"/>
+    <w:bookmarkStart w:id="15" w:name="def-continuous-var"/>
+    <w:p>
+      <w:pPr>
+        <w:pStyle w:val="BodyText"/>
+      </w:pPr>
+      <w:r>
+        <w:rPr>
+          <w:b/>
+          <w:bCs/>
+        </w:rPr>
+        <w:t xml:space="preserve">Definition 4 (Continuous variable)</w:t>
+      </w:r>
+      <w:r>
+        <w:t xml:space="preserve"> </w:t>
+      </w:r>
+      <w:r>
+        <w:t xml:space="preserve">A</w:t>
+      </w:r>
+      <w:r>
+        <w:t xml:space="preserve"> </w:t>
+      </w:r>
+      <w:r>
+        <w:rPr>
+          <w:b/>
+          <w:bCs/>
+        </w:rPr>
+        <w:t xml:space="preserve">continuous variable</w:t>
+      </w:r>
+      <w:r>
+        <w:t xml:space="preserve"> </w:t>
+      </w:r>
+      <w:r>
+        <w:t xml:space="preserve">is a numerical variable whose possible values form an</w:t>
+      </w:r>
+      <w:r>
+        <w:t xml:space="preserve"> </w:t>
+      </w:r>
+      <w:r>
+        <w:t xml:space="preserve">interval (or union of intervals) of real numbers.</w:t>
+      </w:r>
+      <w:r>
+        <w:t xml:space="preserve"> </w:t>
+      </w:r>
+      <w:r>
+        <w:t xml:space="preserve">A continuous variable is always numerical.</w:t>
+      </w:r>
+    </w:p>
+    <w:bookmarkEnd w:id="15"/>
+    <w:bookmarkStart w:id="16" w:name="exm-continuous-var"/>
+    <w:p>
+      <w:pPr>
+        <w:pStyle w:val="BodyText"/>
+      </w:pPr>
+      <w:r>
+        <w:rPr>
+          <w:b/>
+          <w:bCs/>
+        </w:rPr>
+        <w:t xml:space="preserve">Example 4 (Continuous variables in the WCGS)</w:t>
+      </w:r>
+      <w:r>
+        <w:t xml:space="preserve"> </w:t>
+      </w:r>
+      <w:r>
+        <w:t xml:space="preserve">Age, systolic blood pressure, total cholesterol, and body mass index (BMI)</w:t>
+      </w:r>
+      <w:r>
+        <w:t xml:space="preserve"> </w:t>
+      </w:r>
+      <w:r>
+        <w:t xml:space="preserve">are continuous variables:</w:t>
+      </w:r>
+      <w:r>
+        <w:t xml:space="preserve"> </w:t>
+      </w:r>
+      <w:r>
+        <w:t xml:space="preserve">their possible values form a continuum of real numbers.</w:t>
+      </w:r>
+    </w:p>
+    <w:bookmarkEnd w:id="16"/>
+    <w:bookmarkStart w:id="17" w:name="def-discrete-var"/>
+    <w:p>
+      <w:pPr>
+        <w:pStyle w:val="BodyText"/>
+      </w:pPr>
+      <w:r>
+        <w:rPr>
+          <w:b/>
+          <w:bCs/>
+        </w:rPr>
+        <w:t xml:space="preserve">Definition 5 (Discrete variable)</w:t>
+      </w:r>
+      <w:r>
+        <w:t xml:space="preserve"> </w:t>
+      </w:r>
+      <w:r>
+        <w:t xml:space="preserve">A</w:t>
+      </w:r>
+      <w:r>
+        <w:t xml:space="preserve"> </w:t>
+      </w:r>
+      <w:r>
+        <w:rPr>
+          <w:b/>
+          <w:bCs/>
+        </w:rPr>
+        <w:t xml:space="preserve">discrete variable</w:t>
+      </w:r>
+      <w:r>
+        <w:t xml:space="preserve"> </w:t>
+      </w:r>
+      <w:r>
+        <w:t xml:space="preserve">is a variable whose possible values form a</w:t>
+      </w:r>
+      <w:r>
+        <w:t xml:space="preserve"> </w:t>
+      </w:r>
+      <w:r>
+        <w:t xml:space="preserve">countable set.</w:t>
+      </w:r>
+    </w:p>
+    <w:bookmarkEnd w:id="17"/>
+    <w:bookmarkStart w:id="18" w:name="exm-discrete-var"/>
+    <w:p>
+      <w:pPr>
+        <w:pStyle w:val="BodyText"/>
+      </w:pPr>
+      <w:r>
+        <w:rPr>
+          <w:b/>
+          <w:bCs/>
+        </w:rPr>
+        <w:t xml:space="preserve">Example 5 (Discrete variables in the WCGS)</w:t>
+      </w:r>
+      <w:r>
+        <w:t xml:space="preserve"> </w:t>
+      </w:r>
+      <w:r>
+        <w:t xml:space="preserve">In the WCGS dataset:</w:t>
+      </w:r>
+    </w:p>
+    <w:p>
+      <w:pPr>
+        <w:pStyle w:val="Compact"/>
+        <w:numPr>
+          <w:ilvl w:val="0"/>
+          <w:numId w:val="1001"/>
+        </w:numPr>
+      </w:pPr>
+      <w:r>
+        <w:t xml:space="preserve">number of cigarettes per day is a discrete numerical variable (count);</w:t>
+      </w:r>
+    </w:p>
+    <w:p>
+      <w:pPr>
+        <w:pStyle w:val="Compact"/>
+        <w:numPr>
+          <w:ilvl w:val="0"/>
+          <w:numId w:val="1001"/>
+        </w:numPr>
+      </w:pPr>
+      <w:r>
+        <w:t xml:space="preserve">coronary heart disease event status is a discrete categorical variable (binary).</w:t>
+      </w:r>
+    </w:p>
+    <w:bookmarkEnd w:id="18"/>
+    <w:bookmarkStart w:id="19" w:name="rem-numerical-var-subtypes"/>
+    <w:p>
+      <w:pPr>
+        <w:pStyle w:val="FirstParagraph"/>
+      </w:pPr>
+      <w:r>
+        <w:rPr>
+          <w:i/>
+          <w:iCs/>
+        </w:rPr>
+        <w:t xml:space="preserve">Remark 1</w:t>
+      </w:r>
+      <w:r>
+        <w:t xml:space="preserve"> (Subtypes of numerical variables). </w:t>
+      </w:r>
+      <w:r>
+        <w:t xml:space="preserve">A</w:t>
+      </w:r>
+      <w:r>
+        <w:t xml:space="preserve"> </w:t>
+      </w:r>
+      <w:hyperlink w:anchor="def-numerical-var">
+        <w:r>
+          <w:rPr>
+            <w:rStyle w:val="Hyperlink"/>
+          </w:rPr>
+          <w:t xml:space="preserve">numerical variable</w:t>
+        </w:r>
+      </w:hyperlink>
+      <w:r>
+        <w:t xml:space="preserve"> </w:t>
+      </w:r>
+      <w:r>
+        <w:t xml:space="preserve">may be classified in two ways:</w:t>
+      </w:r>
+      <w:r>
+        <w:t xml:space="preserve"> </w:t>
+      </w:r>
+      <w:r>
+        <w:t xml:space="preserve">as an</w:t>
       </w:r>
       <w:r>
         <w:t xml:space="preserve"> </w:t>
@@ -183,14 +602,14 @@
           <w:rPr>
             <w:rStyle w:val="Hyperlink"/>
           </w:rPr>
-          <w:t xml:space="preserve">interval</w:t>
+          <w:t xml:space="preserve">interval variable</w:t>
         </w:r>
       </w:hyperlink>
       <w:r>
         <w:t xml:space="preserve"> </w:t>
       </w:r>
       <w:r>
-        <w:t xml:space="preserve">or</w:t>
+        <w:t xml:space="preserve">or a</w:t>
       </w:r>
       <w:r>
         <w:t xml:space="preserve"> </w:t>
@@ -200,20 +619,17 @@
           <w:rPr>
             <w:rStyle w:val="Hyperlink"/>
           </w:rPr>
-          <w:t xml:space="preserve">ratio</w:t>
+          <w:t xml:space="preserve">ratio variable</w:t>
         </w:r>
       </w:hyperlink>
       <w:r>
-        <w:t xml:space="preserve"> </w:t>
-      </w:r>
-      <w:r>
-        <w:t xml:space="preserve">variables,</w:t>
-      </w:r>
-      <w:r>
-        <w:t xml:space="preserve"> </w:t>
-      </w:r>
-      <w:r>
-        <w:t xml:space="preserve">and as</w:t>
+        <w:t xml:space="preserve">,</w:t>
+      </w:r>
+      <w:r>
+        <w:t xml:space="preserve"> </w:t>
+      </w:r>
+      <w:r>
+        <w:t xml:space="preserve">and as a</w:t>
       </w:r>
       <w:r>
         <w:t xml:space="preserve"> </w:t>
@@ -223,14 +639,14 @@
           <w:rPr>
             <w:rStyle w:val="Hyperlink"/>
           </w:rPr>
-          <w:t xml:space="preserve">continuous</w:t>
+          <w:t xml:space="preserve">continuous variable</w:t>
         </w:r>
       </w:hyperlink>
       <w:r>
         <w:t xml:space="preserve"> </w:t>
       </w:r>
       <w:r>
-        <w:t xml:space="preserve">or</w:t>
+        <w:t xml:space="preserve">or a</w:t>
       </w:r>
       <w:r>
         <w:t xml:space="preserve"> </w:t>
@@ -240,407 +656,25 @@
           <w:rPr>
             <w:rStyle w:val="Hyperlink"/>
           </w:rPr>
-          <w:t xml:space="preserve">discrete</w:t>
+          <w:t xml:space="preserve">discrete variable</w:t>
         </w:r>
       </w:hyperlink>
       <w:r>
         <w:t xml:space="preserve">.</w:t>
       </w:r>
     </w:p>
-    <w:bookmarkEnd w:id="9"/>
-    <w:bookmarkStart w:id="10" w:name="exm-numerical-var"/>
+    <w:bookmarkEnd w:id="19"/>
+    <w:bookmarkStart w:id="20" w:name="rem-discrete-var-types"/>
     <w:p>
       <w:pPr>
         <w:pStyle w:val="BodyText"/>
-      </w:pPr>
-      <w:r>
-        <w:rPr>
-          <w:b/>
-          <w:bCs/>
-        </w:rPr>
-        <w:t xml:space="preserve">Example 1 (Numerical variables in the WCGS)</w:t>
-      </w:r>
-      <w:r>
-        <w:t xml:space="preserve"> </w:t>
-      </w:r>
-      <w:r>
-        <w:t xml:space="preserve">Age, systolic blood pressure, total cholesterol, and number of cigarettes</w:t>
-      </w:r>
-      <w:r>
-        <w:t xml:space="preserve"> </w:t>
-      </w:r>
-      <w:r>
-        <w:t xml:space="preserve">smoked per day are numerical variables in the WCGS dataset.</w:t>
-      </w:r>
-    </w:p>
-    <w:bookmarkEnd w:id="10"/>
-    <w:bookmarkStart w:id="11" w:name="def-interval-var"/>
-    <w:p>
-      <w:pPr>
-        <w:pStyle w:val="BodyText"/>
-      </w:pPr>
-      <w:r>
-        <w:rPr>
-          <w:b/>
-          <w:bCs/>
-        </w:rPr>
-        <w:t xml:space="preserve">Definition 2 (Interval variable)</w:t>
-      </w:r>
-      <w:r>
-        <w:t xml:space="preserve"> </w:t>
-      </w:r>
-      <w:r>
-        <w:t xml:space="preserve">An</w:t>
-      </w:r>
-      <w:r>
-        <w:t xml:space="preserve"> </w:t>
-      </w:r>
-      <w:r>
-        <w:rPr>
-          <w:b/>
-          <w:bCs/>
-        </w:rPr>
-        <w:t xml:space="preserve">interval variable</w:t>
-      </w:r>
-      <w:r>
-        <w:t xml:space="preserve"> </w:t>
-      </w:r>
-      <w:r>
-        <w:t xml:space="preserve">is a numerical variable for which</w:t>
-      </w:r>
-      <w:r>
-        <w:t xml:space="preserve"> </w:t>
-      </w:r>
-      <w:r>
-        <w:t xml:space="preserve">differences between values are meaningful,</w:t>
-      </w:r>
-      <w:r>
-        <w:t xml:space="preserve"> </w:t>
-      </w:r>
-      <w:r>
-        <w:t xml:space="preserve">but there is no natural zero point</w:t>
-      </w:r>
-      <w:r>
-        <w:t xml:space="preserve"> </w:t>
-      </w:r>
-      <w:r>
-        <w:t xml:space="preserve">(so ratios of values are not meaningful).</w:t>
-      </w:r>
-    </w:p>
-    <w:bookmarkEnd w:id="11"/>
-    <w:bookmarkStart w:id="12" w:name="exm-interval-var"/>
-    <w:p>
-      <w:pPr>
-        <w:pStyle w:val="BodyText"/>
-      </w:pPr>
-      <w:r>
-        <w:rPr>
-          <w:b/>
-          <w:bCs/>
-        </w:rPr>
-        <w:t xml:space="preserve">Example 2 (Temperature in degrees Celsius)</w:t>
-      </w:r>
-      <w:r>
-        <w:t xml:space="preserve"> </w:t>
-      </w:r>
-      <w:r>
-        <w:t xml:space="preserve">Temperature in degrees Celsius is an interval variable:</w:t>
-      </w:r>
-      <w:r>
-        <w:t xml:space="preserve"> </w:t>
-      </w:r>
-      <w:r>
-        <w:t xml:space="preserve">a difference of 10 deg C is meaningful,</w:t>
-      </w:r>
-      <w:r>
-        <w:t xml:space="preserve"> </w:t>
-      </w:r>
-      <w:r>
-        <w:t xml:space="preserve">but 30 deg C is not</w:t>
-      </w:r>
-      <w:r>
-        <w:t xml:space="preserve"> </w:t>
-      </w:r>
-      <w:r>
-        <w:t xml:space="preserve">“twice as hot”</w:t>
-      </w:r>
-      <w:r>
-        <w:t xml:space="preserve"> </w:t>
-      </w:r>
-      <w:r>
-        <w:t xml:space="preserve">as 15 deg C</w:t>
-      </w:r>
-      <w:r>
-        <w:t xml:space="preserve"> </w:t>
-      </w:r>
-      <w:r>
-        <w:t xml:space="preserve">because 0 deg C is an arbitrary zero point (the freezing point of water)</w:t>
-      </w:r>
-      <w:r>
-        <w:t xml:space="preserve"> </w:t>
-      </w:r>
-      <w:r>
-        <w:t xml:space="preserve">rather than the complete absence of heat.</w:t>
-      </w:r>
-    </w:p>
-    <w:bookmarkEnd w:id="12"/>
-    <w:bookmarkStart w:id="13" w:name="def-ratio-var"/>
-    <w:p>
-      <w:pPr>
-        <w:pStyle w:val="BodyText"/>
-      </w:pPr>
-      <w:r>
-        <w:rPr>
-          <w:b/>
-          <w:bCs/>
-        </w:rPr>
-        <w:t xml:space="preserve">Definition 3 (Ratio variable)</w:t>
-      </w:r>
-      <w:r>
-        <w:t xml:space="preserve"> </w:t>
-      </w:r>
-      <w:r>
-        <w:t xml:space="preserve">A</w:t>
-      </w:r>
-      <w:r>
-        <w:t xml:space="preserve"> </w:t>
-      </w:r>
-      <w:r>
-        <w:rPr>
-          <w:b/>
-          <w:bCs/>
-        </w:rPr>
-        <w:t xml:space="preserve">ratio variable</w:t>
-      </w:r>
-      <w:r>
-        <w:t xml:space="preserve"> </w:t>
-      </w:r>
-      <w:r>
-        <w:t xml:space="preserve">is a numerical variable with a natural zero point,</w:t>
-      </w:r>
-      <w:r>
-        <w:t xml:space="preserve"> </w:t>
-      </w:r>
-      <w:r>
-        <w:t xml:space="preserve">so that both differences and ratios of values are meaningful.</w:t>
-      </w:r>
-    </w:p>
-    <w:bookmarkEnd w:id="13"/>
-    <w:bookmarkStart w:id="14" w:name="exm-ratio-var"/>
-    <w:p>
-      <w:pPr>
-        <w:pStyle w:val="BodyText"/>
-      </w:pPr>
-      <w:r>
-        <w:rPr>
-          <w:b/>
-          <w:bCs/>
-        </w:rPr>
-        <w:t xml:space="preserve">Example 3 (Ratio variables in the WCGS)</w:t>
-      </w:r>
-      <w:r>
-        <w:t xml:space="preserve"> </w:t>
-      </w:r>
-      <w:r>
-        <w:t xml:space="preserve">Age, weight, cholesterol, blood pressure, and number of cigarettes per day</w:t>
-      </w:r>
-      <w:r>
-        <w:t xml:space="preserve"> </w:t>
-      </w:r>
-      <w:r>
-        <w:t xml:space="preserve">are ratio variables:</w:t>
-      </w:r>
-      <w:r>
-        <w:t xml:space="preserve"> </w:t>
-      </w:r>
-      <w:r>
-        <w:t xml:space="preserve">a value of 0 represents the complete absence of the quantity,</w:t>
-      </w:r>
-      <w:r>
-        <w:t xml:space="preserve"> </w:t>
-      </w:r>
-      <w:r>
-        <w:t xml:space="preserve">so ratios of values are meaningful.</w:t>
-      </w:r>
-    </w:p>
-    <w:bookmarkEnd w:id="14"/>
-    <w:bookmarkStart w:id="15" w:name="def-continuous-var"/>
-    <w:p>
-      <w:pPr>
-        <w:pStyle w:val="BodyText"/>
-      </w:pPr>
-      <w:r>
-        <w:rPr>
-          <w:b/>
-          <w:bCs/>
-        </w:rPr>
-        <w:t xml:space="preserve">Definition 4 (Continuous variable)</w:t>
-      </w:r>
-      <w:r>
-        <w:t xml:space="preserve"> </w:t>
-      </w:r>
-      <w:r>
-        <w:t xml:space="preserve">A</w:t>
-      </w:r>
-      <w:r>
-        <w:t xml:space="preserve"> </w:t>
-      </w:r>
-      <w:r>
-        <w:rPr>
-          <w:b/>
-          <w:bCs/>
-        </w:rPr>
-        <w:t xml:space="preserve">continuous variable</w:t>
-      </w:r>
-      <w:r>
-        <w:t xml:space="preserve"> </w:t>
-      </w:r>
-      <w:r>
-        <w:t xml:space="preserve">is a numerical variable whose possible values form an</w:t>
-      </w:r>
-      <w:r>
-        <w:t xml:space="preserve"> </w:t>
-      </w:r>
-      <w:r>
-        <w:t xml:space="preserve">interval (or union of intervals) of real numbers.</w:t>
-      </w:r>
-      <w:r>
-        <w:t xml:space="preserve"> </w:t>
-      </w:r>
-      <w:r>
-        <w:t xml:space="preserve">A continuous variable is always numerical.</w:t>
-      </w:r>
-    </w:p>
-    <w:bookmarkEnd w:id="15"/>
-    <w:bookmarkStart w:id="16" w:name="exm-continuous-var"/>
-    <w:p>
-      <w:pPr>
-        <w:pStyle w:val="BodyText"/>
-      </w:pPr>
-      <w:r>
-        <w:rPr>
-          <w:b/>
-          <w:bCs/>
-        </w:rPr>
-        <w:t xml:space="preserve">Example 4 (Continuous variables in the WCGS)</w:t>
-      </w:r>
-      <w:r>
-        <w:t xml:space="preserve"> </w:t>
-      </w:r>
-      <w:r>
-        <w:t xml:space="preserve">Age, systolic blood pressure, total cholesterol, and body mass index (BMI)</w:t>
-      </w:r>
-      <w:r>
-        <w:t xml:space="preserve"> </w:t>
-      </w:r>
-      <w:r>
-        <w:t xml:space="preserve">are continuous variables:</w:t>
-      </w:r>
-      <w:r>
-        <w:t xml:space="preserve"> </w:t>
-      </w:r>
-      <w:r>
-        <w:t xml:space="preserve">their possible values form a continuum of real numbers.</w:t>
-      </w:r>
-    </w:p>
-    <w:bookmarkEnd w:id="16"/>
-    <w:bookmarkStart w:id="17" w:name="def-discrete-var"/>
-    <w:p>
-      <w:pPr>
-        <w:pStyle w:val="BodyText"/>
-      </w:pPr>
-      <w:r>
-        <w:rPr>
-          <w:b/>
-          <w:bCs/>
-        </w:rPr>
-        <w:t xml:space="preserve">Definition 5 (Discrete variable)</w:t>
-      </w:r>
-      <w:r>
-        <w:t xml:space="preserve"> </w:t>
-      </w:r>
-      <w:r>
-        <w:t xml:space="preserve">A</w:t>
-      </w:r>
-      <w:r>
-        <w:t xml:space="preserve"> </w:t>
-      </w:r>
-      <w:r>
-        <w:rPr>
-          <w:b/>
-          <w:bCs/>
-        </w:rPr>
-        <w:t xml:space="preserve">discrete variable</w:t>
-      </w:r>
-      <w:r>
-        <w:t xml:space="preserve"> </w:t>
-      </w:r>
-      <w:r>
-        <w:t xml:space="preserve">is a variable whose possible values form a</w:t>
-      </w:r>
-      <w:r>
-        <w:t xml:space="preserve"> </w:t>
-      </w:r>
-      <w:r>
-        <w:t xml:space="preserve">countable set.</w:t>
-      </w:r>
-    </w:p>
-    <w:bookmarkEnd w:id="17"/>
-    <w:bookmarkStart w:id="18" w:name="exm-discrete-var"/>
-    <w:p>
-      <w:pPr>
-        <w:pStyle w:val="BodyText"/>
-      </w:pPr>
-      <w:r>
-        <w:rPr>
-          <w:b/>
-          <w:bCs/>
-        </w:rPr>
-        <w:t xml:space="preserve">Example 5 (Discrete variables in the WCGS)</w:t>
-      </w:r>
-      <w:r>
-        <w:t xml:space="preserve"> </w:t>
-      </w:r>
-      <w:r>
-        <w:t xml:space="preserve">In the WCGS dataset:</w:t>
-      </w:r>
-    </w:p>
-    <w:p>
-      <w:pPr>
-        <w:pStyle w:val="Compact"/>
-        <w:numPr>
-          <w:ilvl w:val="0"/>
-          <w:numId w:val="1001"/>
-        </w:numPr>
-      </w:pPr>
-      <w:r>
-        <w:t xml:space="preserve">number of cigarettes per day is a discrete numerical variable (count);</w:t>
-      </w:r>
-    </w:p>
-    <w:p>
-      <w:pPr>
-        <w:pStyle w:val="Compact"/>
-        <w:numPr>
-          <w:ilvl w:val="0"/>
-          <w:numId w:val="1001"/>
-        </w:numPr>
-      </w:pPr>
-      <w:r>
-        <w:t xml:space="preserve">coronary heart disease event status is a discrete categorical variable (binary).</w:t>
-      </w:r>
-    </w:p>
-    <w:bookmarkEnd w:id="18"/>
-    <w:bookmarkStart w:id="19" w:name="rem-discrete-var-types"/>
-    <w:p>
-      <w:pPr>
-        <w:pStyle w:val="FirstParagraph"/>
       </w:pPr>
       <w:r>
         <w:rPr>
           <w:i/>
           <w:iCs/>
         </w:rPr>
-        <w:t xml:space="preserve">Remark 1</w:t>
+        <w:t xml:space="preserve">Remark 2</w:t>
       </w:r>
       <w:r>
         <w:t xml:space="preserve"> (Types of discrete variables). </w:t>
@@ -687,8 +721,8 @@
         <w:t xml:space="preserve">In contrast, continuous variables are always numerical.</w:t>
       </w:r>
     </w:p>
-    <w:bookmarkEnd w:id="19"/>
-    <w:bookmarkStart w:id="20" w:name="def-categorical-var"/>
+    <w:bookmarkEnd w:id="20"/>
+    <w:bookmarkStart w:id="21" w:name="def-categorical-var"/>
     <w:p>
       <w:pPr>
         <w:pStyle w:val="BodyText"/>
@@ -748,8 +782,8 @@
         <w:t xml:space="preserve">where arithmetic operations such as differences are not meaningful.</w:t>
       </w:r>
     </w:p>
-    <w:bookmarkEnd w:id="20"/>
-    <w:bookmarkStart w:id="21" w:name="exm-categorical-var"/>
+    <w:bookmarkEnd w:id="21"/>
+    <w:bookmarkStart w:id="22" w:name="exm-categorical-var"/>
     <w:p>
       <w:pPr>
         <w:pStyle w:val="BodyText"/>
@@ -774,8 +808,8 @@
         <w:t xml:space="preserve">weight category are categorical variables in the WCGS dataset.</w:t>
       </w:r>
     </w:p>
-    <w:bookmarkEnd w:id="21"/>
-    <w:bookmarkStart w:id="22" w:name="rem-categorical-var-kinds"/>
+    <w:bookmarkEnd w:id="22"/>
+    <w:bookmarkStart w:id="23" w:name="rem-categorical-var-kinds"/>
     <w:p>
       <w:pPr>
         <w:pStyle w:val="BodyText"/>
@@ -785,7 +819,7 @@
           <w:i/>
           <w:iCs/>
         </w:rPr>
-        <w:t xml:space="preserve">Remark 2</w:t>
+        <w:t xml:space="preserve">Remark 3</w:t>
       </w:r>
       <w:r>
         <w:t xml:space="preserve"> (Kinds of categorical variables). </w:t>
@@ -800,8 +834,8 @@
         <w:t xml:space="preserve">and are always discrete.</w:t>
       </w:r>
     </w:p>
-    <w:bookmarkEnd w:id="22"/>
-    <w:bookmarkStart w:id="23" w:name="def-nominal-var"/>
+    <w:bookmarkEnd w:id="23"/>
+    <w:bookmarkStart w:id="24" w:name="def-nominal-var"/>
     <w:p>
       <w:pPr>
         <w:pStyle w:val="BodyText"/>
@@ -842,8 +876,8 @@
         <w:t xml:space="preserve">no natural ordering.</w:t>
       </w:r>
     </w:p>
-    <w:bookmarkEnd w:id="23"/>
-    <w:bookmarkStart w:id="24" w:name="exm-nominal-var"/>
+    <w:bookmarkEnd w:id="24"/>
+    <w:bookmarkStart w:id="25" w:name="exm-nominal-var"/>
     <w:p>
       <w:pPr>
         <w:pStyle w:val="BodyText"/>
@@ -874,8 +908,8 @@
         <w:t xml:space="preserve">there is no natural numerical ordering among the categories.</w:t>
       </w:r>
     </w:p>
-    <w:bookmarkEnd w:id="24"/>
-    <w:bookmarkStart w:id="25" w:name="def-ordinal-var"/>
+    <w:bookmarkEnd w:id="25"/>
+    <w:bookmarkStart w:id="26" w:name="def-ordinal-var"/>
     <w:p>
       <w:pPr>
         <w:pStyle w:val="BodyText"/>
@@ -916,8 +950,8 @@
         <w:t xml:space="preserve">natural ordering.</w:t>
       </w:r>
     </w:p>
-    <w:bookmarkEnd w:id="25"/>
-    <w:bookmarkStart w:id="26" w:name="exm-ordinal-var"/>
+    <w:bookmarkEnd w:id="26"/>
+    <w:bookmarkStart w:id="27" w:name="exm-ordinal-var"/>
     <w:p>
       <w:pPr>
         <w:pStyle w:val="BodyText"/>
@@ -948,8 +982,8 @@
         <w:t xml:space="preserve">though the distances between categories are not measured on a numeric scale.</w:t>
       </w:r>
     </w:p>
-    <w:bookmarkEnd w:id="26"/>
-    <w:bookmarkStart w:id="27" w:name="def-binary-var"/>
+    <w:bookmarkEnd w:id="27"/>
+    <w:bookmarkStart w:id="28" w:name="def-binary-var"/>
     <w:p>
       <w:pPr>
         <w:pStyle w:val="BodyText"/>
@@ -996,8 +1030,8 @@
         <w:t xml:space="preserve">A binary variable is a special case of a nominal variable.</w:t>
       </w:r>
     </w:p>
-    <w:bookmarkEnd w:id="27"/>
-    <w:bookmarkStart w:id="28" w:name="exm-binary-var"/>
+    <w:bookmarkEnd w:id="28"/>
+    <w:bookmarkStart w:id="29" w:name="exm-binary-var"/>
     <w:p>
       <w:pPr>
         <w:pStyle w:val="BodyText"/>
@@ -1040,9 +1074,9 @@
         <w:t xml:space="preserve">, yes/no) are binary variables.</w:t>
       </w:r>
     </w:p>
-    <w:bookmarkEnd w:id="28"/>
     <w:bookmarkEnd w:id="29"/>
-    <w:bookmarkStart w:id="41" w:name="sec-dummy-coding"/>
+    <w:bookmarkEnd w:id="30"/>
+    <w:bookmarkStart w:id="42" w:name="sec-dummy-coding"/>
     <w:p>
       <w:pPr>
         <w:pStyle w:val="Heading2"/>
@@ -1051,7 +1085,7 @@
         <w:t xml:space="preserve">2 Coding a categorical variable with numbers</w:t>
       </w:r>
     </w:p>
-    <w:bookmarkStart w:id="30" w:name="exr-dummy-coding"/>
+    <w:bookmarkStart w:id="31" w:name="exr-dummy-coding"/>
     <w:p>
       <w:pPr>
         <w:pStyle w:val="FirstParagraph"/>
@@ -1148,8 +1182,8 @@
         <w:t xml:space="preserve">and for a person in category A1.</w:t>
       </w:r>
     </w:p>
-    <w:bookmarkEnd w:id="30"/>
-    <w:bookmarkStart w:id="31" w:name="sol-dummy-coding"/>
+    <w:bookmarkEnd w:id="31"/>
+    <w:bookmarkStart w:id="32" w:name="sol-dummy-coding"/>
     <w:p>
       <w:pPr>
         <w:pStyle w:val="FirstParagraph"/>
@@ -1219,8 +1253,8 @@
         <w:t xml:space="preserve">The reference level is the case where all indicators are 0.</w:t>
       </w:r>
     </w:p>
-    <w:bookmarkEnd w:id="31"/>
-    <w:bookmarkStart w:id="32" w:name="def-dummy-variable"/>
+    <w:bookmarkEnd w:id="32"/>
+    <w:bookmarkStart w:id="33" w:name="def-dummy-variable"/>
     <w:p>
       <w:pPr>
         <w:pStyle w:val="BodyText"/>
@@ -1272,8 +1306,8 @@
         <w:t xml:space="preserve">.</w:t>
       </w:r>
     </w:p>
-    <w:bookmarkEnd w:id="32"/>
-    <w:bookmarkStart w:id="33" w:name="exm-dummy-sex"/>
+    <w:bookmarkEnd w:id="33"/>
+    <w:bookmarkStart w:id="34" w:name="exm-dummy-sex"/>
     <w:p>
       <w:pPr>
         <w:pStyle w:val="BodyText"/>
@@ -1580,8 +1614,8 @@
         <w:t xml:space="preserve">.</w:t>
       </w:r>
     </w:p>
-    <w:bookmarkEnd w:id="33"/>
-    <w:bookmarkStart w:id="34" w:name="rem-dummy-other-codings"/>
+    <w:bookmarkEnd w:id="34"/>
+    <w:bookmarkStart w:id="35" w:name="rem-dummy-other-codings"/>
     <w:p>
       <w:pPr>
         <w:pStyle w:val="BodyText"/>
@@ -1591,7 +1625,7 @@
           <w:i/>
           <w:iCs/>
         </w:rPr>
-        <w:t xml:space="preserve">Remark 3</w:t>
+        <w:t xml:space="preserve">Remark 4</w:t>
       </w:r>
       <w:r>
         <w:t xml:space="preserve"> (Other ways to code dummy variables). </w:t>
@@ -1713,8 +1747,8 @@
         <w:t xml:space="preserve">, section 2.4, for details.</w:t>
       </w:r>
     </w:p>
-    <w:bookmarkEnd w:id="34"/>
-    <w:bookmarkStart w:id="35" w:name="def-indicator-variable"/>
+    <w:bookmarkEnd w:id="35"/>
+    <w:bookmarkStart w:id="36" w:name="def-indicator-variable"/>
     <w:p>
       <w:pPr>
         <w:pStyle w:val="BodyText"/>
@@ -1783,8 +1817,8 @@
         <w:t xml:space="preserve">.</w:t>
       </w:r>
     </w:p>
-    <w:bookmarkEnd w:id="35"/>
-    <w:bookmarkStart w:id="36" w:name="exm-indicator-sex"/>
+    <w:bookmarkEnd w:id="36"/>
+    <w:bookmarkStart w:id="37" w:name="exm-indicator-sex"/>
     <w:p>
       <w:pPr>
         <w:pStyle w:val="BodyText"/>
@@ -1895,15 +1929,15 @@
           <w:rPr>
             <w:rStyle w:val="Hyperlink"/>
           </w:rPr>
-          <w:t xml:space="preserve">Remark 3</w:t>
+          <w:t xml:space="preserve">Remark 4</w:t>
         </w:r>
       </w:hyperlink>
       <w:r>
         <w:t xml:space="preserve">) is not an indicator variable.</w:t>
       </w:r>
     </w:p>
-    <w:bookmarkEnd w:id="36"/>
-    <w:bookmarkStart w:id="37" w:name="def-reference-level"/>
+    <w:bookmarkEnd w:id="37"/>
+    <w:bookmarkStart w:id="38" w:name="def-reference-level"/>
     <w:p>
       <w:pPr>
         <w:pStyle w:val="BodyText"/>
@@ -1970,8 +2004,8 @@
         <w:t xml:space="preserve">for every indicator variable of that categorical variable.</w:t>
       </w:r>
     </w:p>
-    <w:bookmarkEnd w:id="37"/>
-    <w:bookmarkStart w:id="38" w:name="rem-source-reference-level"/>
+    <w:bookmarkEnd w:id="38"/>
+    <w:bookmarkStart w:id="39" w:name="rem-source-reference-level"/>
     <w:p>
       <w:pPr>
         <w:pStyle w:val="BodyText"/>
@@ -1981,7 +2015,7 @@
           <w:i/>
           <w:iCs/>
         </w:rPr>
-        <w:t xml:space="preserve">Remark 4</w:t>
+        <w:t xml:space="preserve">Remark 5</w:t>
       </w:r>
       <w:r>
         <w:t xml:space="preserve"> (Source: Reference level). </w:t>
@@ -1993,8 +2027,8 @@
         <w:t xml:space="preserve">, who call this the corner point parameterization.</w:t>
       </w:r>
     </w:p>
-    <w:bookmarkEnd w:id="38"/>
-    <w:bookmarkStart w:id="39" w:name="exm-reference-level-sex"/>
+    <w:bookmarkEnd w:id="39"/>
+    <w:bookmarkStart w:id="40" w:name="exm-reference-level-sex"/>
     <w:p>
       <w:pPr>
         <w:pStyle w:val="BodyText"/>
@@ -2161,8 +2195,8 @@
         <w:t xml:space="preserve">is the reference level.</w:t>
       </w:r>
     </w:p>
-    <w:bookmarkEnd w:id="39"/>
-    <w:bookmarkStart w:id="40" w:name="rem-reference-level-choice"/>
+    <w:bookmarkEnd w:id="40"/>
+    <w:bookmarkStart w:id="41" w:name="rem-reference-level-choice"/>
     <w:p>
       <w:pPr>
         <w:pStyle w:val="BodyText"/>
@@ -2172,7 +2206,7 @@
           <w:i/>
           <w:iCs/>
         </w:rPr>
-        <w:t xml:space="preserve">Remark 5</w:t>
+        <w:t xml:space="preserve">Remark 6</w:t>
       </w:r>
       <w:r>
         <w:t xml:space="preserve"> (Any category can be the reference level). </w:t>
@@ -2260,9 +2294,9 @@
         <w:t xml:space="preserve">Both choices describe the same two groups.</w:t>
       </w:r>
     </w:p>
-    <w:bookmarkEnd w:id="40"/>
     <w:bookmarkEnd w:id="41"/>
-    <w:bookmarkStart w:id="49" w:name="taxonomy-of-variable-types"/>
+    <w:bookmarkEnd w:id="42"/>
+    <w:bookmarkStart w:id="50" w:name="taxonomy-of-variable-types"/>
     <w:p>
       <w:pPr>
         <w:pStyle w:val="Heading2"/>
@@ -2303,7 +2337,7 @@
       <w:tr>
         <w:tc>
           <w:tcPr/>
-          <w:bookmarkStart w:id="45" w:name="fig-var-taxonomy"/>
+          <w:bookmarkStart w:id="46" w:name="fig-var-taxonomy"/>
           <w:p>
             <w:pPr>
               <w:pStyle w:val="SourceCode"/>
@@ -5493,18 +5527,18 @@
                 <wp:inline>
                   <wp:extent cx="4620126" cy="3696101"/>
                   <wp:effectExtent b="0" l="0" r="0" t="0"/>
-                  <wp:docPr descr="" title="" id="43" name="Picture"/>
+                  <wp:docPr descr="" title="" id="44" name="Picture"/>
                   <a:graphic>
                     <a:graphicData uri="http://schemas.openxmlformats.org/drawingml/2006/picture">
                       <pic:pic>
                         <pic:nvPicPr>
-                          <pic:cNvPr descr="data_files/figure-docx/unnamed-chunk-1-1.png" id="44" name="Picture"/>
+                          <pic:cNvPr descr="data_files/figure-docx/unnamed-chunk-1-1.png" id="45" name="Picture"/>
                           <pic:cNvPicPr>
                             <a:picLocks noChangeArrowheads="1" noChangeAspect="1"/>
                           </pic:cNvPicPr>
                         </pic:nvPicPr>
                         <pic:blipFill>
-                          <a:blip r:embed="rId42"/>
+                          <a:blip r:embed="rId43"/>
                           <a:stretch>
                             <a:fillRect/>
                           </a:stretch>
@@ -5556,7 +5590,7 @@
               <w:t xml:space="preserve">binary, nominal, and ordinal variables are discrete and categorical.</w:t>
             </w:r>
           </w:p>
-          <w:bookmarkEnd w:id="45"/>
+          <w:bookmarkEnd w:id="46"/>
         </w:tc>
       </w:tr>
     </w:tbl>
@@ -5609,18 +5643,18 @@
                 <wp:inline>
                   <wp:extent cx="152400" cy="152400"/>
                   <wp:effectExtent b="0" l="0" r="0" t="0"/>
-                  <wp:docPr descr="" title="" id="47" name="Picture"/>
+                  <wp:docPr descr="" title="" id="48" name="Picture"/>
                   <a:graphic>
                     <a:graphicData uri="http://schemas.openxmlformats.org/drawingml/2006/picture">
                       <pic:pic>
                         <pic:nvPicPr>
-                          <pic:cNvPr descr="/opt/quarto/share/formats/docx/note.png" id="48" name="Picture"/>
+                          <pic:cNvPr descr="/opt/quarto/share/formats/docx/note.png" id="49" name="Picture"/>
                           <pic:cNvPicPr>
                             <a:picLocks noChangeArrowheads="1" noChangeAspect="1"/>
                           </pic:cNvPicPr>
                         </pic:nvPicPr>
                         <pic:blipFill>
-                          <a:blip r:embed="rId46"/>
+                          <a:blip r:embed="rId47"/>
                           <a:stretch>
                             <a:fillRect/>
                           </a:stretch>
@@ -5708,8 +5742,8 @@
         </w:tc>
       </w:tr>
     </w:tbl>
-    <w:bookmarkEnd w:id="49"/>
-    <w:bookmarkStart w:id="51" w:name="variables-in-the-wcgs-dataset"/>
+    <w:bookmarkEnd w:id="50"/>
+    <w:bookmarkStart w:id="52" w:name="variables-in-the-wcgs-dataset"/>
     <w:p>
       <w:pPr>
         <w:pStyle w:val="Heading2"/>
@@ -5756,7 +5790,7 @@
       <w:tr>
         <w:tc>
           <w:tcPr/>
-          <w:bookmarkStart w:id="50" w:name="tbl-wcgs-vartypes"/>
+          <w:bookmarkStart w:id="51" w:name="tbl-wcgs-vartypes"/>
           <w:p>
             <w:pPr>
               <w:jc w:val="center"/>
@@ -7456,13 +7490,13 @@
               </w:tc>
             </w:tr>
           </w:tbl>
-          <w:bookmarkEnd w:id="50"/>
+          <w:bookmarkEnd w:id="51"/>
           <w:p/>
         </w:tc>
       </w:tr>
     </w:tbl>
-    <w:bookmarkEnd w:id="51"/>
-    <w:bookmarkStart w:id="63" w:name="random-variables"/>
+    <w:bookmarkEnd w:id="52"/>
+    <w:bookmarkStart w:id="64" w:name="random-variables"/>
     <w:p>
       <w:pPr>
         <w:pStyle w:val="Heading2"/>
@@ -7471,7 +7505,7 @@
         <w:t xml:space="preserve">5 Random variables</w:t>
       </w:r>
     </w:p>
-    <w:bookmarkStart w:id="55" w:name="sec-binary-vars"/>
+    <w:bookmarkStart w:id="56" w:name="sec-binary-vars"/>
     <w:p>
       <w:pPr>
         <w:pStyle w:val="Heading3"/>
@@ -7480,7 +7514,7 @@
         <w:t xml:space="preserve">5.1 Binary variables</w:t>
       </w:r>
     </w:p>
-    <w:bookmarkStart w:id="52" w:name="def-binary"/>
+    <w:bookmarkStart w:id="53" w:name="def-binary"/>
     <w:p>
       <w:pPr>
         <w:pStyle w:val="FirstParagraph"/>
@@ -7515,8 +7549,8 @@
         <w:t xml:space="preserve">is a random variable which has only two possible values in its range.</w:t>
       </w:r>
     </w:p>
-    <w:bookmarkEnd w:id="52"/>
-    <w:bookmarkStart w:id="53" w:name="exr-binary-examples"/>
+    <w:bookmarkEnd w:id="53"/>
+    <w:bookmarkStart w:id="54" w:name="exr-binary-examples"/>
     <w:p>
       <w:pPr>
         <w:pStyle w:val="BodyText"/>
@@ -7535,8 +7569,8 @@
         <w:t xml:space="preserve">What are some examples of binary variables in health sciences and data science?</w:t>
       </w:r>
     </w:p>
-    <w:bookmarkEnd w:id="53"/>
-    <w:bookmarkStart w:id="54" w:name="sol-binary-examples"/>
+    <w:bookmarkEnd w:id="54"/>
+    <w:bookmarkStart w:id="55" w:name="sol-binary-examples"/>
     <w:p>
       <w:pPr>
         <w:pStyle w:val="BodyText"/>
@@ -7627,9 +7661,9 @@
         <w:t xml:space="preserve">vital status (dead vs alive)</w:t>
       </w:r>
     </w:p>
-    <w:bookmarkEnd w:id="54"/>
     <w:bookmarkEnd w:id="55"/>
-    <w:bookmarkStart w:id="62" w:name="sec-count-vars"/>
+    <w:bookmarkEnd w:id="56"/>
+    <w:bookmarkStart w:id="63" w:name="sec-count-vars"/>
     <w:p>
       <w:pPr>
         <w:pStyle w:val="Heading3"/>
@@ -7638,7 +7672,7 @@
         <w:t xml:space="preserve">5.2 Count variables</w:t>
       </w:r>
     </w:p>
-    <w:bookmarkStart w:id="56" w:name="def-count"/>
+    <w:bookmarkStart w:id="57" w:name="def-count"/>
     <w:p>
       <w:pPr>
         <w:pStyle w:val="FirstParagraph"/>
@@ -7746,8 +7780,8 @@
         </m:oMath>
       </m:oMathPara>
     </w:p>
-    <w:bookmarkEnd w:id="56"/>
-    <w:bookmarkStart w:id="57" w:name="exr-count-examples"/>
+    <w:bookmarkEnd w:id="57"/>
+    <w:bookmarkStart w:id="58" w:name="exr-count-examples"/>
     <w:p>
       <w:pPr>
         <w:pStyle w:val="FirstParagraph"/>
@@ -7766,8 +7800,8 @@
         <w:t xml:space="preserve">What are some examples of count variables?</w:t>
       </w:r>
     </w:p>
-    <w:bookmarkEnd w:id="57"/>
-    <w:bookmarkStart w:id="58" w:name="sol-count-examples"/>
+    <w:bookmarkEnd w:id="58"/>
+    <w:bookmarkStart w:id="59" w:name="sol-count-examples"/>
     <w:p>
       <w:pPr>
         <w:pStyle w:val="BodyText"/>
@@ -7858,8 +7892,8 @@
         <w:t xml:space="preserve">car accidents per 1,000 miles driven</w:t>
       </w:r>
     </w:p>
-    <w:bookmarkEnd w:id="58"/>
-    <w:bookmarkStart w:id="61" w:name="X6b0346f757a1c2a16c9954023d63d8ec54b03e4"/>
+    <w:bookmarkEnd w:id="59"/>
+    <w:bookmarkStart w:id="62" w:name="X6b0346f757a1c2a16c9954023d63d8ec54b03e4"/>
     <w:p>
       <w:pPr>
         <w:pStyle w:val="Heading4"/>
@@ -7884,7 +7918,7 @@
           <w:numId w:val="1006"/>
         </w:numPr>
       </w:pPr>
-      <w:hyperlink r:id="rId59">
+      <w:hyperlink r:id="rId60">
         <w:r>
           <w:rPr>
             <w:rStyle w:val="Hyperlink"/>
@@ -7901,7 +7935,7 @@
           <w:numId w:val="1006"/>
         </w:numPr>
       </w:pPr>
-      <w:hyperlink r:id="rId60">
+      <w:hyperlink r:id="rId61">
         <w:r>
           <w:rPr>
             <w:rStyle w:val="Hyperlink"/>
@@ -7910,10 +7944,10 @@
         </w:r>
       </w:hyperlink>
     </w:p>
-    <w:bookmarkEnd w:id="61"/>
     <w:bookmarkEnd w:id="62"/>
     <w:bookmarkEnd w:id="63"/>
-    <w:bookmarkStart w:id="67" w:name="references"/>
+    <w:bookmarkEnd w:id="64"/>
+    <w:bookmarkStart w:id="68" w:name="references"/>
     <w:p>
       <w:pPr>
         <w:pStyle w:val="Heading2"/>
@@ -7922,8 +7956,8 @@
         <w:t xml:space="preserve">References</w:t>
       </w:r>
     </w:p>
-    <w:bookmarkStart w:id="66" w:name="refs"/>
-    <w:bookmarkStart w:id="65" w:name="ref-dobson4e"/>
+    <w:bookmarkStart w:id="67" w:name="refs"/>
+    <w:bookmarkStart w:id="66" w:name="ref-dobson4e"/>
     <w:p>
       <w:pPr>
         <w:pStyle w:val="Bibliography"/>
@@ -7956,7 +7990,7 @@
       <w:r>
         <w:t xml:space="preserve"> </w:t>
       </w:r>
-      <w:hyperlink r:id="rId64">
+      <w:hyperlink r:id="rId65">
         <w:r>
           <w:rPr>
             <w:rStyle w:val="Hyperlink"/>
@@ -7968,9 +8002,9 @@
         <w:t xml:space="preserve">.</w:t>
       </w:r>
     </w:p>
-    <w:bookmarkEnd w:id="65"/>
     <w:bookmarkEnd w:id="66"/>
     <w:bookmarkEnd w:id="67"/>
+    <w:bookmarkEnd w:id="68"/>
     <w:sectPr>
       <w:footnotePr>
         <w:numRestart w:val="eachSect"/>

</xml_diff>